<commit_message>
Experimento 18 e atualização de documentação
</commit_message>
<xml_diff>
--- a/Documents and Backups/Documentacao ResNet.docx
+++ b/Documents and Backups/Documentacao ResNet.docx
@@ -100,53 +100,12 @@
       <w:r>
         <w:t xml:space="preserve"> Artigo de referência - </w:t>
       </w:r>
-      <w:proofErr w:type="spellStart"/>
       <w:r>
         <w:rPr>
           <w:i/>
           <w:iCs/>
         </w:rPr>
-        <w:t>Deep</w:t>
-      </w:r>
-      <w:proofErr w:type="spellEnd"/>
-      <w:r>
-        <w:rPr>
-          <w:i/>
-          <w:iCs/>
-        </w:rPr>
-        <w:t xml:space="preserve"> Residual Learning for </w:t>
-      </w:r>
-      <w:proofErr w:type="spellStart"/>
-      <w:r>
-        <w:rPr>
-          <w:i/>
-          <w:iCs/>
-        </w:rPr>
-        <w:t>Image</w:t>
-      </w:r>
-      <w:proofErr w:type="spellEnd"/>
-      <w:r>
-        <w:rPr>
-          <w:i/>
-          <w:iCs/>
-        </w:rPr>
-        <w:t xml:space="preserve"> </w:t>
-      </w:r>
-      <w:proofErr w:type="spellStart"/>
-      <w:r>
-        <w:rPr>
-          <w:i/>
-          <w:iCs/>
-        </w:rPr>
-        <w:t>Recognition</w:t>
-      </w:r>
-      <w:proofErr w:type="spellEnd"/>
-      <w:r>
-        <w:rPr>
-          <w:i/>
-          <w:iCs/>
-        </w:rPr>
-        <w:t>.</w:t>
+        <w:t>Deep Residual Learning for Image Recognition.</w:t>
       </w:r>
     </w:p>
     <w:p>
@@ -172,7 +131,6 @@
       <w:r>
         <w:t xml:space="preserve">Foi utilizada a base ImageNet1K no formato </w:t>
       </w:r>
-      <w:proofErr w:type="spellStart"/>
       <w:r>
         <w:rPr>
           <w:i/>
@@ -180,11 +138,9 @@
         </w:rPr>
         <w:t>TFRecords</w:t>
       </w:r>
-      <w:proofErr w:type="spellEnd"/>
       <w:r>
         <w:t xml:space="preserve">, um formato binário de serialização do </w:t>
       </w:r>
-      <w:proofErr w:type="spellStart"/>
       <w:r>
         <w:rPr>
           <w:i/>
@@ -192,7 +148,6 @@
         </w:rPr>
         <w:t>TensorFlow</w:t>
       </w:r>
-      <w:proofErr w:type="spellEnd"/>
       <w:r>
         <w:t xml:space="preserve"> projetado para armazenar exemplos (imagem + rótulo) de forma eficiente e compacta.</w:t>
       </w:r>
@@ -310,7 +265,6 @@
       <w:r>
         <w:t xml:space="preserve"> partir da imagem redimensionada, é extraído aleatoriamente um </w:t>
       </w:r>
-      <w:proofErr w:type="spellStart"/>
       <w:r>
         <w:rPr>
           <w:i/>
@@ -318,11 +272,9 @@
         </w:rPr>
         <w:t>crop</w:t>
       </w:r>
-      <w:proofErr w:type="spellEnd"/>
       <w:r>
         <w:t xml:space="preserve"> de tamanho 224×224, compatível com o tamanho de entrada da </w:t>
       </w:r>
-      <w:proofErr w:type="spellStart"/>
       <w:r>
         <w:rPr>
           <w:i/>
@@ -330,7 +282,6 @@
         </w:rPr>
         <w:t>ResNet</w:t>
       </w:r>
-      <w:proofErr w:type="spellEnd"/>
       <w:r>
         <w:t>.</w:t>
       </w:r>
@@ -345,15 +296,7 @@
         <w:jc w:val="both"/>
       </w:pPr>
       <w:r>
-        <w:t xml:space="preserve">Antes da extração do </w:t>
-      </w:r>
-      <w:proofErr w:type="spellStart"/>
-      <w:r>
-        <w:t>crop</w:t>
-      </w:r>
-      <w:proofErr w:type="spellEnd"/>
-      <w:r>
-        <w:t xml:space="preserve">, pode-se aplicar opcionalmente um espelhamento horizontal (horizontal flip) na imagem </w:t>
+        <w:t xml:space="preserve">Antes da extração do crop, pode-se aplicar opcionalmente um espelhamento horizontal (horizontal flip) na imagem </w:t>
       </w:r>
     </w:p>
     <w:p>
@@ -371,7 +314,6 @@
       <w:r>
         <w:t xml:space="preserve">pós o </w:t>
       </w:r>
-      <w:proofErr w:type="spellStart"/>
       <w:r>
         <w:rPr>
           <w:i/>
@@ -379,7 +321,6 @@
         </w:rPr>
         <w:t>crop</w:t>
       </w:r>
-      <w:proofErr w:type="spellEnd"/>
       <w:r>
         <w:t>, é realizada a normalização dos pixels segundo a expressão:</w:t>
       </w:r>
@@ -448,7 +389,6 @@
         </w:numPr>
         <w:jc w:val="both"/>
       </w:pPr>
-      <w:proofErr w:type="spellStart"/>
       <w:r>
         <w:rPr>
           <w:b/>
@@ -459,11 +399,9 @@
         </w:rPr>
         <w:t>imagenet_mean</w:t>
       </w:r>
-      <w:proofErr w:type="spellEnd"/>
       <w:r>
         <w:t xml:space="preserve"> e </w:t>
       </w:r>
-      <w:proofErr w:type="spellStart"/>
       <w:r>
         <w:rPr>
           <w:b/>
@@ -474,11 +412,9 @@
         </w:rPr>
         <w:t>imagenet_std</w:t>
       </w:r>
-      <w:proofErr w:type="spellEnd"/>
       <w:r>
         <w:t xml:space="preserve"> correspondem à média e ao desvio padrão calculados a partir do conjunto </w:t>
       </w:r>
-      <w:proofErr w:type="spellStart"/>
       <w:r>
         <w:rPr>
           <w:i/>
@@ -486,7 +422,6 @@
         </w:rPr>
         <w:t>ImageNet</w:t>
       </w:r>
-      <w:proofErr w:type="spellEnd"/>
       <w:r>
         <w:t xml:space="preserve">. Essa normalização é aplicada </w:t>
       </w:r>
@@ -528,50 +463,23 @@
       <w:r>
         <w:t xml:space="preserve"> Existe uma diferença de implementação entre o </w:t>
       </w:r>
-      <w:proofErr w:type="spellStart"/>
       <w:r>
         <w:rPr>
           <w:i/>
           <w:iCs/>
         </w:rPr>
-        <w:t>framwork</w:t>
-      </w:r>
-      <w:proofErr w:type="spellEnd"/>
+        <w:t>framwork ‘Caffe’</w:t>
+      </w:r>
+      <w:r>
+        <w:t xml:space="preserve"> utilizado pelos autores e o </w:t>
+      </w:r>
       <w:r>
         <w:rPr>
           <w:i/>
           <w:iCs/>
         </w:rPr>
-        <w:t xml:space="preserve"> ‘</w:t>
-      </w:r>
-      <w:proofErr w:type="spellStart"/>
-      <w:r>
-        <w:rPr>
-          <w:i/>
-          <w:iCs/>
-        </w:rPr>
-        <w:t>Caffe</w:t>
-      </w:r>
-      <w:proofErr w:type="spellEnd"/>
-      <w:r>
-        <w:rPr>
-          <w:i/>
-          <w:iCs/>
-        </w:rPr>
-        <w:t>’</w:t>
-      </w:r>
-      <w:r>
-        <w:t xml:space="preserve"> utilizado pelos autores e o </w:t>
-      </w:r>
-      <w:proofErr w:type="spellStart"/>
-      <w:r>
-        <w:rPr>
-          <w:i/>
-          <w:iCs/>
-        </w:rPr>
         <w:t>Tensorflow</w:t>
       </w:r>
-      <w:proofErr w:type="spellEnd"/>
     </w:p>
     <w:p>
       <w:pPr>
@@ -782,21 +690,8 @@
         </w:numPr>
         <w:jc w:val="both"/>
       </w:pPr>
-      <w:proofErr w:type="spellStart"/>
-      <w:r>
-        <w:t>Weight</w:t>
-      </w:r>
-      <w:proofErr w:type="spellEnd"/>
-      <w:r>
-        <w:t xml:space="preserve"> </w:t>
-      </w:r>
-      <w:proofErr w:type="spellStart"/>
-      <w:r>
-        <w:t>Decay</w:t>
-      </w:r>
-      <w:proofErr w:type="spellEnd"/>
-      <w:r>
-        <w:t xml:space="preserve"> – 1e-4 (na prática aplicado como L2 em kernels)</w:t>
+      <w:r>
+        <w:t>Weight Decay – 1e-4 (na prática aplicado como L2 em kernels)</w:t>
       </w:r>
     </w:p>
     <w:p>
@@ -821,40 +716,14 @@
         </w:numPr>
         <w:jc w:val="both"/>
       </w:pPr>
-      <w:proofErr w:type="spellStart"/>
-      <w:r>
-        <w:t>SparseCategoricalCrossentropy</w:t>
-      </w:r>
-      <w:proofErr w:type="spellEnd"/>
-      <w:r>
-        <w:t xml:space="preserve">(...) — os rótulos da </w:t>
-      </w:r>
-      <w:proofErr w:type="spellStart"/>
-      <w:r>
-        <w:t>ImageNet</w:t>
-      </w:r>
-      <w:proofErr w:type="spellEnd"/>
+      <w:r>
+        <w:t>SparseCategoricalCrossentropy(...) — os rótulos da ImageNet</w:t>
+      </w:r>
       <w:r>
         <w:t xml:space="preserve"> </w:t>
       </w:r>
       <w:r>
-        <w:t xml:space="preserve">são inteiros, então </w:t>
-      </w:r>
-      <w:proofErr w:type="spellStart"/>
-      <w:r>
-        <w:t>sparse</w:t>
-      </w:r>
-      <w:proofErr w:type="spellEnd"/>
-      <w:r>
-        <w:t xml:space="preserve"> é o </w:t>
-      </w:r>
-      <w:proofErr w:type="spellStart"/>
-      <w:r>
-        <w:t>loss</w:t>
-      </w:r>
-      <w:proofErr w:type="spellEnd"/>
-      <w:r>
-        <w:t xml:space="preserve"> apropriado </w:t>
+        <w:t xml:space="preserve">são inteiros, então sparse é o loss apropriado </w:t>
       </w:r>
     </w:p>
     <w:p>
@@ -867,37 +736,13 @@
         <w:jc w:val="both"/>
       </w:pPr>
       <w:r>
-        <w:t xml:space="preserve">Métricas de treinamento </w:t>
-      </w:r>
-      <w:proofErr w:type="spellStart"/>
-      <w:r>
-        <w:t>utilziadas</w:t>
-      </w:r>
-      <w:proofErr w:type="spellEnd"/>
-      <w:r>
-        <w:t xml:space="preserve"> foram</w:t>
+        <w:t>Métricas de treinamento utilziadas foram</w:t>
       </w:r>
       <w:r>
         <w:t xml:space="preserve"> –</w:t>
       </w:r>
       <w:r>
-        <w:t xml:space="preserve"> </w:t>
-      </w:r>
-      <w:proofErr w:type="spellStart"/>
-      <w:r>
-        <w:t>accuracy</w:t>
-      </w:r>
-      <w:proofErr w:type="spellEnd"/>
-      <w:r>
-        <w:t xml:space="preserve"> (top-1) e </w:t>
-      </w:r>
-      <w:proofErr w:type="spellStart"/>
-      <w:r>
-        <w:t>SparseTopKCategoricalAccuracy</w:t>
-      </w:r>
-      <w:proofErr w:type="spellEnd"/>
-      <w:r>
-        <w:t>(k=5) (top-5).</w:t>
+        <w:t xml:space="preserve"> accuracy (top-1) e SparseTopKCategoricalAccuracy(k=5) (top-5).</w:t>
       </w:r>
     </w:p>
     <w:p>
@@ -1194,39 +1039,7 @@
         <w:t xml:space="preserve">Resultados: </w:t>
       </w:r>
       <w:r>
-        <w:t xml:space="preserve">Os Logs do </w:t>
-      </w:r>
-      <w:proofErr w:type="spellStart"/>
-      <w:r>
-        <w:t>Pycharm</w:t>
-      </w:r>
-      <w:proofErr w:type="spellEnd"/>
-      <w:r>
-        <w:t xml:space="preserve"> estão localizados em "\Projetos do Mestrado (Git)\Projeto-Classificadores\Main_Validation\ResNet-50\Results\Experimento 1 - </w:t>
-      </w:r>
-      <w:proofErr w:type="spellStart"/>
-      <w:r>
-        <w:t>ResNet</w:t>
-      </w:r>
-      <w:proofErr w:type="spellEnd"/>
-      <w:r>
-        <w:t xml:space="preserve">\Experimento 1 -RN- </w:t>
-      </w:r>
-      <w:proofErr w:type="spellStart"/>
-      <w:r>
-        <w:t>Sanity</w:t>
-      </w:r>
-      <w:proofErr w:type="spellEnd"/>
-      <w:r>
-        <w:t xml:space="preserve"> </w:t>
-      </w:r>
-      <w:proofErr w:type="spellStart"/>
-      <w:r>
-        <w:t>Check</w:t>
-      </w:r>
-      <w:proofErr w:type="spellEnd"/>
-      <w:r>
-        <w:t xml:space="preserve"> - LOG"</w:t>
+        <w:t>Os Logs do Pycharm estão localizados em "\Projetos do Mestrado (Git)\Projeto-Classificadores\Main_Validation\ResNet-50\Results\Experimento 1 - ResNet\Experimento 1 -RN- Sanity Check - LOG"</w:t>
       </w:r>
     </w:p>
     <w:p>
@@ -1458,23 +1271,7 @@
           <w:sz w:val="18"/>
           <w:szCs w:val="18"/>
         </w:rPr>
-        <w:t>do experimento 2 (</w:t>
-      </w:r>
-      <w:proofErr w:type="spellStart"/>
-      <w:r>
-        <w:rPr>
-          <w:sz w:val="18"/>
-          <w:szCs w:val="18"/>
-        </w:rPr>
-        <w:t>ResNet</w:t>
-      </w:r>
-      <w:proofErr w:type="spellEnd"/>
-      <w:r>
-        <w:rPr>
-          <w:sz w:val="18"/>
-          <w:szCs w:val="18"/>
-        </w:rPr>
-        <w:t>)</w:t>
+        <w:t>do experimento 2 (ResNet)</w:t>
       </w:r>
       <w:r>
         <w:rPr>
@@ -1575,93 +1372,21 @@
           <w:iCs/>
           <w:color w:val="000000" w:themeColor="text1"/>
         </w:rPr>
-        <w:t xml:space="preserve">Logs do </w:t>
-      </w:r>
-      <w:proofErr w:type="spellStart"/>
+        <w:t xml:space="preserve">Logs do Pycharm </w:t>
+      </w:r>
+      <w:r>
+        <w:rPr>
+          <w:color w:val="000000" w:themeColor="text1"/>
+        </w:rPr>
+        <w:t xml:space="preserve">estão </w:t>
+      </w:r>
       <w:r>
         <w:rPr>
           <w:i/>
           <w:iCs/>
           <w:color w:val="000000" w:themeColor="text1"/>
         </w:rPr>
-        <w:t>Pycharm</w:t>
-      </w:r>
-      <w:proofErr w:type="spellEnd"/>
-      <w:r>
-        <w:rPr>
-          <w:i/>
-          <w:iCs/>
-          <w:color w:val="000000" w:themeColor="text1"/>
-        </w:rPr>
-        <w:t xml:space="preserve"> </w:t>
-      </w:r>
-      <w:r>
-        <w:rPr>
-          <w:color w:val="000000" w:themeColor="text1"/>
-        </w:rPr>
-        <w:t xml:space="preserve">estão </w:t>
-      </w:r>
-      <w:r>
-        <w:rPr>
-          <w:i/>
-          <w:iCs/>
-          <w:color w:val="000000" w:themeColor="text1"/>
-        </w:rPr>
-        <w:t xml:space="preserve">localizados em "\Projeto-Classificadores\Main_Project\ResNet50\Results\Experimento 2 - </w:t>
-      </w:r>
-      <w:proofErr w:type="spellStart"/>
-      <w:r>
-        <w:rPr>
-          <w:i/>
-          <w:iCs/>
-          <w:color w:val="000000" w:themeColor="text1"/>
-        </w:rPr>
-        <w:t>ResNet</w:t>
-      </w:r>
-      <w:proofErr w:type="spellEnd"/>
-      <w:r>
-        <w:rPr>
-          <w:i/>
-          <w:iCs/>
-          <w:color w:val="000000" w:themeColor="text1"/>
-        </w:rPr>
-        <w:t xml:space="preserve">\Experimento 2 -RN- </w:t>
-      </w:r>
-      <w:proofErr w:type="spellStart"/>
-      <w:r>
-        <w:rPr>
-          <w:i/>
-          <w:iCs/>
-          <w:color w:val="000000" w:themeColor="text1"/>
-        </w:rPr>
-        <w:t>Sanity</w:t>
-      </w:r>
-      <w:proofErr w:type="spellEnd"/>
-      <w:r>
-        <w:rPr>
-          <w:i/>
-          <w:iCs/>
-          <w:color w:val="000000" w:themeColor="text1"/>
-        </w:rPr>
-        <w:t xml:space="preserve"> </w:t>
-      </w:r>
-      <w:proofErr w:type="spellStart"/>
-      <w:r>
-        <w:rPr>
-          <w:i/>
-          <w:iCs/>
-          <w:color w:val="000000" w:themeColor="text1"/>
-        </w:rPr>
-        <w:t>Check</w:t>
-      </w:r>
-      <w:proofErr w:type="spellEnd"/>
-      <w:r>
-        <w:rPr>
-          <w:i/>
-          <w:iCs/>
-          <w:color w:val="000000" w:themeColor="text1"/>
-        </w:rPr>
-        <w:t xml:space="preserve"> - LOG.txt"</w:t>
+        <w:t>localizados em "\Projeto-Classificadores\Main_Project\ResNet50\Results\Experimento 2 - ResNet\Experimento 2 -RN- Sanity Check - LOG.txt"</w:t>
       </w:r>
     </w:p>
     <w:p>
@@ -1702,87 +1427,7 @@
           <w:i/>
           <w:iCs/>
         </w:rPr>
-        <w:t xml:space="preserve"> Os </w:t>
-      </w:r>
-      <w:proofErr w:type="spellStart"/>
-      <w:r>
-        <w:rPr>
-          <w:i/>
-          <w:iCs/>
-        </w:rPr>
-        <w:t>warnings</w:t>
-      </w:r>
-      <w:proofErr w:type="spellEnd"/>
-      <w:r>
-        <w:rPr>
-          <w:i/>
-          <w:iCs/>
-        </w:rPr>
-        <w:t xml:space="preserve"> extensos presentes no arquivo de log relacionados a </w:t>
-      </w:r>
-      <w:proofErr w:type="spellStart"/>
-      <w:r>
-        <w:rPr>
-          <w:i/>
-          <w:iCs/>
-        </w:rPr>
-        <w:t>while_loop</w:t>
-      </w:r>
-      <w:proofErr w:type="spellEnd"/>
-      <w:r>
-        <w:rPr>
-          <w:i/>
-          <w:iCs/>
-        </w:rPr>
-        <w:t xml:space="preserve">, </w:t>
-      </w:r>
-      <w:proofErr w:type="spellStart"/>
-      <w:r>
-        <w:rPr>
-          <w:i/>
-          <w:iCs/>
-        </w:rPr>
-        <w:t>StatelessRandomUniform</w:t>
-      </w:r>
-      <w:proofErr w:type="spellEnd"/>
-      <w:r>
-        <w:rPr>
-          <w:i/>
-          <w:iCs/>
-        </w:rPr>
-        <w:t xml:space="preserve">, ImageProjectiveTransformV3 e AdjustContrastv2 não representam um problema funcional. Eles indicam apenas que o </w:t>
-      </w:r>
-      <w:proofErr w:type="spellStart"/>
-      <w:r>
-        <w:rPr>
-          <w:i/>
-          <w:iCs/>
-        </w:rPr>
-        <w:t>TensorFlow</w:t>
-      </w:r>
-      <w:proofErr w:type="spellEnd"/>
-      <w:r>
-        <w:rPr>
-          <w:i/>
-          <w:iCs/>
-        </w:rPr>
-        <w:t xml:space="preserve"> está encapsulando operações de data </w:t>
-      </w:r>
-      <w:proofErr w:type="spellStart"/>
-      <w:r>
-        <w:rPr>
-          <w:i/>
-          <w:iCs/>
-        </w:rPr>
-        <w:t>augmentation</w:t>
-      </w:r>
-      <w:proofErr w:type="spellEnd"/>
-      <w:r>
-        <w:rPr>
-          <w:i/>
-          <w:iCs/>
-        </w:rPr>
-        <w:t xml:space="preserve"> estocástico em laços internos por limitações do conversor de grafo. </w:t>
+        <w:t xml:space="preserve"> Os warnings extensos presentes no arquivo de log relacionados a while_loop, StatelessRandomUniform, ImageProjectiveTransformV3 e AdjustContrastv2 não representam um problema funcional. Eles indicam apenas que o TensorFlow está encapsulando operações de data augmentation estocástico em laços internos por limitações do conversor de grafo. </w:t>
       </w:r>
     </w:p>
     <w:p>
@@ -1819,7 +1464,6 @@
       <w:r>
         <w:t xml:space="preserve">Apesar da </w:t>
       </w:r>
-      <w:proofErr w:type="spellStart"/>
       <w:r>
         <w:rPr>
           <w:i/>
@@ -1827,7 +1471,6 @@
         </w:rPr>
         <w:t>loss</w:t>
       </w:r>
-      <w:proofErr w:type="spellEnd"/>
       <w:r>
         <w:t xml:space="preserve"> de validação apresentar uma leve redução ao longo das épocas, a acurácia</w:t>
       </w:r>
@@ -1932,7 +1575,6 @@
       <w:r>
         <w:t xml:space="preserve">Do ponto de vista funcional, o </w:t>
       </w:r>
-      <w:proofErr w:type="spellStart"/>
       <w:r>
         <w:rPr>
           <w:i/>
@@ -1940,7 +1582,6 @@
         </w:rPr>
         <w:t>DataLoader</w:t>
       </w:r>
-      <w:proofErr w:type="spellEnd"/>
       <w:r>
         <w:t xml:space="preserve"> </w:t>
       </w:r>
@@ -1956,7 +1597,6 @@
       <w:r>
         <w:t xml:space="preserve">: ele carrega imagens, cria splits treino/validação, aplica </w:t>
       </w:r>
-      <w:proofErr w:type="spellStart"/>
       <w:r>
         <w:rPr>
           <w:i/>
@@ -1964,46 +1604,32 @@
         </w:rPr>
         <w:t>augmentations</w:t>
       </w:r>
-      <w:proofErr w:type="spellEnd"/>
       <w:r>
         <w:t xml:space="preserve">, normaliza os pixels e entrega </w:t>
       </w:r>
-      <w:proofErr w:type="spellStart"/>
       <w:r>
         <w:rPr>
           <w:i/>
           <w:iCs/>
         </w:rPr>
-        <w:t>tf.</w:t>
-      </w:r>
-      <w:proofErr w:type="gramStart"/>
+        <w:t>tf.data.Dataset</w:t>
+      </w:r>
+      <w:r>
+        <w:t xml:space="preserve"> válidos</w:t>
+      </w:r>
+      <w:r>
+        <w:t xml:space="preserve">. </w:t>
+      </w:r>
+      <w:r>
+        <w:t xml:space="preserve">No entanto, do ponto de vista metodológico e estatístico, esse </w:t>
+      </w:r>
       <w:r>
         <w:rPr>
           <w:i/>
           <w:iCs/>
         </w:rPr>
-        <w:t>data.Dataset</w:t>
-      </w:r>
-      <w:proofErr w:type="spellEnd"/>
-      <w:proofErr w:type="gramEnd"/>
-      <w:r>
-        <w:t xml:space="preserve"> válidos</w:t>
-      </w:r>
-      <w:r>
-        <w:t xml:space="preserve">. </w:t>
-      </w:r>
-      <w:r>
-        <w:t xml:space="preserve">No entanto, do ponto de vista metodológico e estatístico, esse </w:t>
-      </w:r>
-      <w:proofErr w:type="spellStart"/>
-      <w:r>
-        <w:rPr>
-          <w:i/>
-          <w:iCs/>
-        </w:rPr>
         <w:t>loader</w:t>
       </w:r>
-      <w:proofErr w:type="spellEnd"/>
       <w:r>
         <w:t xml:space="preserve"> não </w:t>
       </w:r>
@@ -2064,7 +1690,6 @@
       <w:r>
         <w:t xml:space="preserve">uso de </w:t>
       </w:r>
-      <w:proofErr w:type="spellStart"/>
       <w:r>
         <w:rPr>
           <w:i/>
@@ -2072,11 +1697,9 @@
         </w:rPr>
         <w:t>image_dataset_from_directory</w:t>
       </w:r>
-      <w:proofErr w:type="spellEnd"/>
       <w:r>
         <w:t xml:space="preserve"> com </w:t>
       </w:r>
-      <w:proofErr w:type="spellStart"/>
       <w:r>
         <w:rPr>
           <w:i/>
@@ -2084,11 +1707,9 @@
         </w:rPr>
         <w:t>validation_split</w:t>
       </w:r>
-      <w:proofErr w:type="spellEnd"/>
       <w:r>
         <w:t xml:space="preserve"> no mesmo diretório raiz. Esse método assume que todas as classes estão perfeitamente balanceadas e distribuídas de forma aleatória no </w:t>
       </w:r>
-      <w:proofErr w:type="spellStart"/>
       <w:r>
         <w:rPr>
           <w:i/>
@@ -2096,11 +1717,9 @@
         </w:rPr>
         <w:t>filesystem</w:t>
       </w:r>
-      <w:proofErr w:type="spellEnd"/>
       <w:r>
         <w:t xml:space="preserve">, o que raramente é verdade em </w:t>
       </w:r>
-      <w:proofErr w:type="spellStart"/>
       <w:r>
         <w:rPr>
           <w:i/>
@@ -2108,11 +1727,9 @@
         </w:rPr>
         <w:t>datasets</w:t>
       </w:r>
-      <w:proofErr w:type="spellEnd"/>
       <w:r>
         <w:t xml:space="preserve"> reais. O split é feito por ordem interna do </w:t>
       </w:r>
-      <w:proofErr w:type="spellStart"/>
       <w:r>
         <w:rPr>
           <w:i/>
@@ -2120,7 +1737,6 @@
         </w:rPr>
         <w:t>loader</w:t>
       </w:r>
-      <w:proofErr w:type="spellEnd"/>
       <w:r>
         <w:t>, não por semântica da classe.</w:t>
       </w:r>
@@ -2154,7 +1770,6 @@
       <w:r>
         <w:t xml:space="preserve"> aplicação de </w:t>
       </w:r>
-      <w:proofErr w:type="spellStart"/>
       <w:r>
         <w:rPr>
           <w:i/>
@@ -2162,7 +1777,6 @@
         </w:rPr>
         <w:t>augmentations</w:t>
       </w:r>
-      <w:proofErr w:type="spellEnd"/>
       <w:r>
         <w:t xml:space="preserve"> pesadas apenas no treino, enquanto a validação recebe imagens apenas redimensionadas e </w:t>
       </w:r>
@@ -2219,7 +1833,6 @@
       <w:r>
         <w:t xml:space="preserve">fixação de </w:t>
       </w:r>
-      <w:proofErr w:type="spellStart"/>
       <w:r>
         <w:rPr>
           <w:i/>
@@ -2227,11 +1840,9 @@
         </w:rPr>
         <w:t>steps_per_epoch</w:t>
       </w:r>
-      <w:proofErr w:type="spellEnd"/>
       <w:r>
         <w:t xml:space="preserve"> e </w:t>
       </w:r>
-      <w:proofErr w:type="spellStart"/>
       <w:r>
         <w:rPr>
           <w:i/>
@@ -2239,11 +1850,9 @@
         </w:rPr>
         <w:t>validation_steps</w:t>
       </w:r>
-      <w:proofErr w:type="spellEnd"/>
       <w:r>
         <w:t xml:space="preserve"> manualmente no trainer, enquanto o </w:t>
       </w:r>
-      <w:proofErr w:type="spellStart"/>
       <w:r>
         <w:rPr>
           <w:i/>
@@ -2251,11 +1860,9 @@
         </w:rPr>
         <w:t>DataLoader</w:t>
       </w:r>
-      <w:proofErr w:type="spellEnd"/>
       <w:r>
         <w:t xml:space="preserve"> já entrega </w:t>
       </w:r>
-      <w:proofErr w:type="spellStart"/>
       <w:r>
         <w:rPr>
           <w:i/>
@@ -2263,11 +1870,9 @@
         </w:rPr>
         <w:t>datasets</w:t>
       </w:r>
-      <w:proofErr w:type="spellEnd"/>
       <w:r>
         <w:t xml:space="preserve"> com cardinalidade definida. Isso cria uma situação em que o </w:t>
       </w:r>
-      <w:proofErr w:type="spellStart"/>
       <w:r>
         <w:rPr>
           <w:i/>
@@ -2275,7 +1880,6 @@
         </w:rPr>
         <w:t>Keras</w:t>
       </w:r>
-      <w:proofErr w:type="spellEnd"/>
       <w:r>
         <w:t xml:space="preserve"> não está necessariamente avaliando todas as amostras de validação, e pode estar avaliando batches repetidos ou truncados. </w:t>
       </w:r>
@@ -2308,7 +1912,6 @@
       <w:r>
         <w:t xml:space="preserve">Os scripts de carregamento de dados foram reescritos, evitando os erros previamente discutidos. Adicionalmente, as funções definidas para divisão correta da base de dados foram alocadas no arquivo Utils.py, separando-a do arquivo </w:t>
       </w:r>
-      <w:proofErr w:type="spellStart"/>
       <w:r>
         <w:rPr>
           <w:i/>
@@ -2317,7 +1920,6 @@
         </w:rPr>
         <w:t>DataLoader</w:t>
       </w:r>
-      <w:proofErr w:type="spellEnd"/>
       <w:r>
         <w:t xml:space="preserve"> específico da arquitetura. Agora, a estrutura esperada segue conforme ilustrado pela figura </w:t>
       </w:r>
@@ -2457,39 +2059,7 @@
         <w:t xml:space="preserve">Resultados: </w:t>
       </w:r>
       <w:r>
-        <w:t xml:space="preserve">Os Logs do </w:t>
-      </w:r>
-      <w:proofErr w:type="spellStart"/>
-      <w:r>
-        <w:t>Pycharm</w:t>
-      </w:r>
-      <w:proofErr w:type="spellEnd"/>
-      <w:r>
-        <w:t xml:space="preserve"> estão localizados em "\Projeto-Classificadores\Main_Project\ResNet50\Results\Experimento 3 - </w:t>
-      </w:r>
-      <w:proofErr w:type="spellStart"/>
-      <w:r>
-        <w:t>ResNet</w:t>
-      </w:r>
-      <w:proofErr w:type="spellEnd"/>
-      <w:r>
-        <w:t xml:space="preserve">\Experimento 3 -RN- </w:t>
-      </w:r>
-      <w:proofErr w:type="spellStart"/>
-      <w:r>
-        <w:t>Sanity</w:t>
-      </w:r>
-      <w:proofErr w:type="spellEnd"/>
-      <w:r>
-        <w:t xml:space="preserve"> </w:t>
-      </w:r>
-      <w:proofErr w:type="spellStart"/>
-      <w:r>
-        <w:t>Check</w:t>
-      </w:r>
-      <w:proofErr w:type="spellEnd"/>
-      <w:r>
-        <w:t xml:space="preserve"> - LOG.txt"</w:t>
+        <w:t>Os Logs do Pycharm estão localizados em "\Projeto-Classificadores\Main_Project\ResNet50\Results\Experimento 3 - ResNet\Experimento 3 -RN- Sanity Check - LOG.txt"</w:t>
       </w:r>
     </w:p>
     <w:p>
@@ -2522,23 +2092,7 @@
           <w:b/>
           <w:bCs/>
         </w:rPr>
-        <w:t xml:space="preserve">Testes voltados à exploração de </w:t>
-      </w:r>
-      <w:proofErr w:type="spellStart"/>
-      <w:r>
-        <w:rPr>
-          <w:b/>
-          <w:bCs/>
-        </w:rPr>
-        <w:t>hiperparâmetros</w:t>
-      </w:r>
-      <w:proofErr w:type="spellEnd"/>
-      <w:r>
-        <w:rPr>
-          <w:b/>
-          <w:bCs/>
-        </w:rPr>
-        <w:t xml:space="preserve"> </w:t>
+        <w:t xml:space="preserve">Testes voltados à exploração de hiperparâmetros </w:t>
       </w:r>
       <w:r>
         <w:rPr>
@@ -2613,7 +2167,6 @@
       <w:r>
         <w:t xml:space="preserve"> </w:t>
       </w:r>
-      <w:proofErr w:type="spellStart"/>
       <w:r>
         <w:rPr>
           <w:i/>
@@ -2621,7 +2174,6 @@
         </w:rPr>
         <w:t>dataset</w:t>
       </w:r>
-      <w:proofErr w:type="spellEnd"/>
       <w:r>
         <w:t xml:space="preserve"> </w:t>
       </w:r>
@@ -2925,7 +2477,6 @@
         <w:rPr>
           <w:b/>
           <w:bCs/>
-          <w:lang w:val="en-US"/>
         </w:rPr>
       </w:pPr>
     </w:p>
@@ -2949,7 +2500,6 @@
         </w:rPr>
         <w:t xml:space="preserve">Impacto do Learning Rate </w:t>
       </w:r>
-      <w:proofErr w:type="spellStart"/>
       <w:r>
         <w:rPr>
           <w:b/>
@@ -2959,7 +2509,6 @@
         </w:rPr>
         <w:t>Scheduler</w:t>
       </w:r>
-      <w:proofErr w:type="spellEnd"/>
       <w:r>
         <w:rPr>
           <w:b/>
@@ -3041,64 +2590,14 @@
           <w:iCs/>
           <w:color w:val="000000" w:themeColor="text1"/>
         </w:rPr>
-        <w:t xml:space="preserve">Logs do </w:t>
-      </w:r>
-      <w:proofErr w:type="spellStart"/>
+        <w:t xml:space="preserve">Logs do Pycharm estão localizados em </w:t>
+      </w:r>
       <w:r>
         <w:rPr>
           <w:i/>
           <w:iCs/>
-          <w:color w:val="000000" w:themeColor="text1"/>
-        </w:rPr>
-        <w:t>Pycharm</w:t>
-      </w:r>
-      <w:proofErr w:type="spellEnd"/>
-      <w:r>
-        <w:rPr>
-          <w:i/>
-          <w:iCs/>
-          <w:color w:val="000000" w:themeColor="text1"/>
-        </w:rPr>
-        <w:t xml:space="preserve"> estão localizados em </w:t>
-      </w:r>
-      <w:r>
-        <w:rPr>
-          <w:i/>
-          <w:iCs/>
-        </w:rPr>
-        <w:t xml:space="preserve">"\Projeto-Classificadores\Main_Project\ResNet50\Results\Experimento 5 - </w:t>
-      </w:r>
-      <w:proofErr w:type="spellStart"/>
-      <w:r>
-        <w:rPr>
-          <w:i/>
-          <w:iCs/>
-        </w:rPr>
-        <w:t>ResNet</w:t>
-      </w:r>
-      <w:proofErr w:type="spellEnd"/>
-      <w:r>
-        <w:rPr>
-          <w:i/>
-          <w:iCs/>
-        </w:rPr>
-        <w:t xml:space="preserve">\Experimento 5 - </w:t>
-      </w:r>
-      <w:proofErr w:type="spellStart"/>
-      <w:r>
-        <w:rPr>
-          <w:i/>
-          <w:iCs/>
-        </w:rPr>
-        <w:t>Pycharm</w:t>
-      </w:r>
-      <w:proofErr w:type="spellEnd"/>
-      <w:r>
-        <w:rPr>
-          <w:i/>
-          <w:iCs/>
-        </w:rPr>
-        <w:t xml:space="preserve"> LOG.txt"</w:t>
+        </w:rPr>
+        <w:t>"\Projeto-Classificadores\Main_Project\ResNet50\Results\Experimento 5 - ResNet\Experimento 5 - Pycharm LOG.txt"</w:t>
       </w:r>
     </w:p>
     <w:p>
@@ -3165,7 +2664,6 @@
       <w:r>
         <w:t xml:space="preserve">Este experimento busca adequar a profundidade da rede com o tamanho do </w:t>
       </w:r>
-      <w:proofErr w:type="spellStart"/>
       <w:r>
         <w:rPr>
           <w:i/>
@@ -3173,7 +2671,6 @@
         </w:rPr>
         <w:t>Dataset</w:t>
       </w:r>
-      <w:proofErr w:type="spellEnd"/>
       <w:r>
         <w:t xml:space="preserve">. </w:t>
       </w:r>
@@ -3227,59 +2724,23 @@
       <w:r>
         <w:t xml:space="preserve"> ponto crucial é que a ResNet-18 utiliza blocos residuais simples (</w:t>
       </w:r>
-      <w:proofErr w:type="spellStart"/>
       <w:r>
         <w:rPr>
           <w:i/>
           <w:iCs/>
         </w:rPr>
-        <w:t>basic</w:t>
-      </w:r>
-      <w:proofErr w:type="spellEnd"/>
+        <w:t>basic blocks</w:t>
+      </w:r>
+      <w:r>
+        <w:t xml:space="preserve">) em vez de </w:t>
+      </w:r>
       <w:r>
         <w:rPr>
           <w:i/>
           <w:iCs/>
         </w:rPr>
-        <w:t xml:space="preserve"> </w:t>
-      </w:r>
-      <w:proofErr w:type="spellStart"/>
-      <w:r>
-        <w:rPr>
-          <w:i/>
-          <w:iCs/>
-        </w:rPr>
-        <w:t>blocks</w:t>
-      </w:r>
-      <w:proofErr w:type="spellEnd"/>
-      <w:r>
-        <w:t xml:space="preserve">) em vez de </w:t>
-      </w:r>
-      <w:proofErr w:type="spellStart"/>
-      <w:r>
-        <w:rPr>
-          <w:i/>
-          <w:iCs/>
-        </w:rPr>
-        <w:t>bottleneck</w:t>
-      </w:r>
-      <w:proofErr w:type="spellEnd"/>
-      <w:r>
-        <w:rPr>
-          <w:i/>
-          <w:iCs/>
-        </w:rPr>
-        <w:t xml:space="preserve"> </w:t>
-      </w:r>
-      <w:proofErr w:type="spellStart"/>
-      <w:r>
-        <w:rPr>
-          <w:i/>
-          <w:iCs/>
-        </w:rPr>
-        <w:t>blocks</w:t>
-      </w:r>
-      <w:proofErr w:type="spellEnd"/>
+        <w:t>bottleneck blocks</w:t>
+      </w:r>
       <w:r>
         <w:t>. Esses blocos são estruturalmente mais simples, com menos convoluções por bloco, o que torna o aprendizado mais estável em regimes de poucos dados.</w:t>
       </w:r>
@@ -3328,7 +2789,6 @@
       <w:r>
         <w:t xml:space="preserve"> </w:t>
       </w:r>
-      <w:proofErr w:type="spellStart"/>
       <w:r>
         <w:rPr>
           <w:i/>
@@ -3336,19 +2796,15 @@
         </w:rPr>
         <w:t>loss</w:t>
       </w:r>
-      <w:proofErr w:type="spellEnd"/>
       <w:r>
         <w:t xml:space="preserve"> já aparece como </w:t>
       </w:r>
-      <w:proofErr w:type="spellStart"/>
       <w:r>
         <w:t>NaN</w:t>
       </w:r>
-      <w:proofErr w:type="spellEnd"/>
       <w:r>
         <w:t xml:space="preserve"> no primeiro batch da </w:t>
       </w:r>
-      <w:proofErr w:type="spellStart"/>
       <w:r>
         <w:rPr>
           <w:i/>
@@ -3356,7 +2812,6 @@
         </w:rPr>
         <w:t>Epoch</w:t>
       </w:r>
-      <w:proofErr w:type="spellEnd"/>
       <w:r>
         <w:t xml:space="preserve"> 1, tanto no treino quanto na validação. </w:t>
       </w:r>
@@ -3437,15 +2892,7 @@
         <w:t>Clip de gradiente</w:t>
       </w:r>
       <w:r>
-        <w:t xml:space="preserve"> (</w:t>
-      </w:r>
-      <w:proofErr w:type="spellStart"/>
-      <w:r>
-        <w:t>ClipNorm</w:t>
-      </w:r>
-      <w:proofErr w:type="spellEnd"/>
-      <w:r>
-        <w:t>)</w:t>
+        <w:t xml:space="preserve"> (ClipNorm)</w:t>
       </w:r>
       <w:r>
         <w:t xml:space="preserve"> para blindar contra explosões residuais</w:t>
@@ -3496,7 +2943,6 @@
       <w:r>
         <w:t xml:space="preserve">O parâmetro </w:t>
       </w:r>
-      <w:proofErr w:type="spellStart"/>
       <w:r>
         <w:rPr>
           <w:i/>
@@ -3504,7 +2950,6 @@
         </w:rPr>
         <w:t>clipnorm</w:t>
       </w:r>
-      <w:proofErr w:type="spellEnd"/>
       <w:r>
         <w:t xml:space="preserve"> </w:t>
       </w:r>
@@ -3520,31 +2965,13 @@
       <w:r>
         <w:t xml:space="preserve"> </w:t>
       </w:r>
-      <w:proofErr w:type="spellStart"/>
       <w:r>
         <w:rPr>
           <w:i/>
           <w:iCs/>
         </w:rPr>
-        <w:t>exploding</w:t>
-      </w:r>
-      <w:proofErr w:type="spellEnd"/>
-      <w:r>
-        <w:rPr>
-          <w:i/>
-          <w:iCs/>
-        </w:rPr>
-        <w:t xml:space="preserve"> </w:t>
-      </w:r>
-      <w:proofErr w:type="spellStart"/>
-      <w:r>
-        <w:rPr>
-          <w:i/>
-          <w:iCs/>
-        </w:rPr>
-        <w:t>gradients</w:t>
-      </w:r>
-      <w:proofErr w:type="spellEnd"/>
+        <w:t>exploding gradients</w:t>
+      </w:r>
       <w:r>
         <w:t xml:space="preserve">. Durante o treinamento, os gradientes da função de perda em relação aos pesos </w:t>
       </w:r>
@@ -3582,7 +3009,6 @@
       <w:r>
         <w:t xml:space="preserve"> </w:t>
       </w:r>
-      <w:proofErr w:type="spellStart"/>
       <w:r>
         <w:rPr>
           <w:i/>
@@ -3590,7 +3016,6 @@
         </w:rPr>
         <w:t>clipnorm</w:t>
       </w:r>
-      <w:proofErr w:type="spellEnd"/>
       <w:r>
         <w:t xml:space="preserve"> atua limitando a </w:t>
       </w:r>
@@ -4026,15 +3451,7 @@
         <w:jc w:val="both"/>
       </w:pPr>
       <w:r>
-        <w:t xml:space="preserve">Este experimento busca aprofundar a análise conduzida no Experimento 6, mantendo a mesma variação rasa da arquitetura </w:t>
-      </w:r>
-      <w:proofErr w:type="spellStart"/>
-      <w:r>
-        <w:t>ResNet</w:t>
-      </w:r>
-      <w:proofErr w:type="spellEnd"/>
-      <w:r>
-        <w:t xml:space="preserve"> (ResNet-18), bem como o mesmo protocolo de treinamento e estratégia de otimização. A principal modificação introduzida consiste no aumento do tamanho do batch, que foi ampliado de 32 para 64 amostras por iteração.</w:t>
+        <w:t>Este experimento busca aprofundar a análise conduzida no Experimento 6, mantendo a mesma variação rasa da arquitetura ResNet (ResNet-18), bem como o mesmo protocolo de treinamento e estratégia de otimização. A principal modificação introduzida consiste no aumento do tamanho do batch, que foi ampliado de 32 para 64 amostras por iteração.</w:t>
       </w:r>
     </w:p>
     <w:p>
@@ -4312,7 +3729,6 @@
       <w:r>
         <w:t xml:space="preserve">da família </w:t>
       </w:r>
-      <w:proofErr w:type="spellStart"/>
       <w:r>
         <w:rPr>
           <w:i/>
@@ -4320,7 +3736,6 @@
         </w:rPr>
         <w:t>ResNet</w:t>
       </w:r>
-      <w:proofErr w:type="spellEnd"/>
       <w:r>
         <w:t xml:space="preserve">, </w:t>
       </w:r>
@@ -4333,7 +3748,6 @@
       <w:r>
         <w:t xml:space="preserve">utiliza o chamado </w:t>
       </w:r>
-      <w:proofErr w:type="spellStart"/>
       <w:r>
         <w:rPr>
           <w:i/>
@@ -4341,11 +3755,9 @@
         </w:rPr>
         <w:t>BasicBlock</w:t>
       </w:r>
-      <w:proofErr w:type="spellEnd"/>
       <w:r>
         <w:t xml:space="preserve">, que é composto por dois blocos convolucionais 3×3 consecutivos, cada um seguido por Batch </w:t>
       </w:r>
-      <w:proofErr w:type="spellStart"/>
       <w:r>
         <w:rPr>
           <w:i/>
@@ -4353,11 +3765,9 @@
         </w:rPr>
         <w:t>Normalization</w:t>
       </w:r>
-      <w:proofErr w:type="spellEnd"/>
       <w:r>
         <w:t xml:space="preserve"> e </w:t>
       </w:r>
-      <w:proofErr w:type="spellStart"/>
       <w:r>
         <w:rPr>
           <w:i/>
@@ -4365,7 +3775,6 @@
         </w:rPr>
         <w:t>ReLU</w:t>
       </w:r>
-      <w:proofErr w:type="spellEnd"/>
       <w:r>
         <w:t>.</w:t>
       </w:r>
@@ -4566,15 +3975,7 @@
         <w:t>.</w:t>
       </w:r>
       <w:r>
-        <w:t xml:space="preserve"> A ideia deste experimento é igualar o </w:t>
-      </w:r>
-      <w:proofErr w:type="spellStart"/>
-      <w:r>
-        <w:t>batch_size</w:t>
-      </w:r>
-      <w:proofErr w:type="spellEnd"/>
-      <w:r>
-        <w:t xml:space="preserve"> para garantir qual apresenta melhor desempenho sob as mesmas condições de treino.</w:t>
+        <w:t xml:space="preserve"> A ideia deste experimento é igualar o batch_size para garantir qual apresenta melhor desempenho sob as mesmas condições de treino.</w:t>
       </w:r>
     </w:p>
     <w:p>
@@ -4855,64 +4256,14 @@
           <w:iCs/>
           <w:color w:val="000000" w:themeColor="text1"/>
         </w:rPr>
-        <w:t xml:space="preserve">Logs do </w:t>
-      </w:r>
-      <w:proofErr w:type="spellStart"/>
+        <w:t xml:space="preserve">Logs do Pycharm estão localizados em </w:t>
+      </w:r>
       <w:r>
         <w:rPr>
           <w:i/>
           <w:iCs/>
-          <w:color w:val="000000" w:themeColor="text1"/>
-        </w:rPr>
-        <w:t>Pycharm</w:t>
-      </w:r>
-      <w:proofErr w:type="spellEnd"/>
-      <w:r>
-        <w:rPr>
-          <w:i/>
-          <w:iCs/>
-          <w:color w:val="000000" w:themeColor="text1"/>
-        </w:rPr>
-        <w:t xml:space="preserve"> estão localizados em </w:t>
-      </w:r>
-      <w:r>
-        <w:rPr>
-          <w:i/>
-          <w:iCs/>
-        </w:rPr>
-        <w:t xml:space="preserve">"\Projeto-Classificadores\Main_Project\ResNet\Results\Experimento 11 - </w:t>
-      </w:r>
-      <w:proofErr w:type="spellStart"/>
-      <w:r>
-        <w:rPr>
-          <w:i/>
-          <w:iCs/>
-        </w:rPr>
-        <w:t>ResNet</w:t>
-      </w:r>
-      <w:proofErr w:type="spellEnd"/>
-      <w:r>
-        <w:rPr>
-          <w:i/>
-          <w:iCs/>
-        </w:rPr>
-        <w:t xml:space="preserve">\Experimento 11- </w:t>
-      </w:r>
-      <w:proofErr w:type="spellStart"/>
-      <w:r>
-        <w:rPr>
-          <w:i/>
-          <w:iCs/>
-        </w:rPr>
-        <w:t>Pycharm</w:t>
-      </w:r>
-      <w:proofErr w:type="spellEnd"/>
-      <w:r>
-        <w:rPr>
-          <w:i/>
-          <w:iCs/>
-        </w:rPr>
-        <w:t xml:space="preserve"> LOG.txt"</w:t>
+        </w:rPr>
+        <w:t>"\Projeto-Classificadores\Main_Project\ResNet\Results\Experimento 11 - ResNet\Experimento 11- Pycharm LOG.txt"</w:t>
       </w:r>
     </w:p>
     <w:p>
@@ -5143,64 +4494,14 @@
           <w:iCs/>
           <w:color w:val="000000" w:themeColor="text1"/>
         </w:rPr>
-        <w:t xml:space="preserve">Logs do </w:t>
-      </w:r>
-      <w:proofErr w:type="spellStart"/>
+        <w:t xml:space="preserve">Logs do Pycharm estão localizados em </w:t>
+      </w:r>
       <w:r>
         <w:rPr>
           <w:i/>
           <w:iCs/>
-          <w:color w:val="000000" w:themeColor="text1"/>
-        </w:rPr>
-        <w:t>Pycharm</w:t>
-      </w:r>
-      <w:proofErr w:type="spellEnd"/>
-      <w:r>
-        <w:rPr>
-          <w:i/>
-          <w:iCs/>
-          <w:color w:val="000000" w:themeColor="text1"/>
-        </w:rPr>
-        <w:t xml:space="preserve"> estão localizados em </w:t>
-      </w:r>
-      <w:r>
-        <w:rPr>
-          <w:i/>
-          <w:iCs/>
-        </w:rPr>
-        <w:t xml:space="preserve">"\Projeto-Classificadores\Main_Project\ResNet\Results\Experimento 12 - </w:t>
-      </w:r>
-      <w:proofErr w:type="spellStart"/>
-      <w:r>
-        <w:rPr>
-          <w:i/>
-          <w:iCs/>
-        </w:rPr>
-        <w:t>ResNet</w:t>
-      </w:r>
-      <w:proofErr w:type="spellEnd"/>
-      <w:r>
-        <w:rPr>
-          <w:i/>
-          <w:iCs/>
-        </w:rPr>
-        <w:t xml:space="preserve">\Experimento 12- </w:t>
-      </w:r>
-      <w:proofErr w:type="spellStart"/>
-      <w:r>
-        <w:rPr>
-          <w:i/>
-          <w:iCs/>
-        </w:rPr>
-        <w:t>Pycharm</w:t>
-      </w:r>
-      <w:proofErr w:type="spellEnd"/>
-      <w:r>
-        <w:rPr>
-          <w:i/>
-          <w:iCs/>
-        </w:rPr>
-        <w:t xml:space="preserve"> LOG.txt"</w:t>
+        </w:rPr>
+        <w:t>"\Projeto-Classificadores\Main_Project\ResNet\Results\Experimento 12 - ResNet\Experimento 12- Pycharm LOG.txt"</w:t>
       </w:r>
     </w:p>
     <w:p>
@@ -5330,15 +4631,7 @@
         <w:t xml:space="preserve">deste experimento é </w:t>
       </w:r>
       <w:r>
-        <w:t xml:space="preserve">tentar alcançar um platô nos resultados, utilizando a configuração que obteve a maior eficiência dentre os experimentos anteriores (Variante 18 com Batch </w:t>
-      </w:r>
-      <w:proofErr w:type="spellStart"/>
-      <w:r>
-        <w:t>Size</w:t>
-      </w:r>
-      <w:proofErr w:type="spellEnd"/>
-      <w:r>
-        <w:t xml:space="preserve"> = 32)</w:t>
+        <w:t>tentar alcançar um platô nos resultados, utilizando a configuração que obteve a maior eficiência dentre os experimentos anteriores (Variante 18 com Batch Size = 32)</w:t>
       </w:r>
     </w:p>
     <w:p>
@@ -5491,64 +4784,14 @@
           <w:iCs/>
           <w:color w:val="000000" w:themeColor="text1"/>
         </w:rPr>
-        <w:t xml:space="preserve">Logs do </w:t>
-      </w:r>
-      <w:proofErr w:type="spellStart"/>
+        <w:t xml:space="preserve">Logs do Pycharm estão localizados em </w:t>
+      </w:r>
       <w:r>
         <w:rPr>
           <w:i/>
           <w:iCs/>
-          <w:color w:val="000000" w:themeColor="text1"/>
-        </w:rPr>
-        <w:t>Pycharm</w:t>
-      </w:r>
-      <w:proofErr w:type="spellEnd"/>
-      <w:r>
-        <w:rPr>
-          <w:i/>
-          <w:iCs/>
-          <w:color w:val="000000" w:themeColor="text1"/>
-        </w:rPr>
-        <w:t xml:space="preserve"> estão localizados em </w:t>
-      </w:r>
-      <w:r>
-        <w:rPr>
-          <w:i/>
-          <w:iCs/>
-        </w:rPr>
-        <w:t xml:space="preserve">"\Projeto-Classificadores\Main_Project\ResNet\Results\Experimento 13 - </w:t>
-      </w:r>
-      <w:proofErr w:type="spellStart"/>
-      <w:r>
-        <w:rPr>
-          <w:i/>
-          <w:iCs/>
-        </w:rPr>
-        <w:t>ResNet</w:t>
-      </w:r>
-      <w:proofErr w:type="spellEnd"/>
-      <w:r>
-        <w:rPr>
-          <w:i/>
-          <w:iCs/>
-        </w:rPr>
-        <w:t xml:space="preserve">\Experimento 13- </w:t>
-      </w:r>
-      <w:proofErr w:type="spellStart"/>
-      <w:r>
-        <w:rPr>
-          <w:i/>
-          <w:iCs/>
-        </w:rPr>
-        <w:t>Pycharm</w:t>
-      </w:r>
-      <w:proofErr w:type="spellEnd"/>
-      <w:r>
-        <w:rPr>
-          <w:i/>
-          <w:iCs/>
-        </w:rPr>
-        <w:t xml:space="preserve"> LOG.txt"</w:t>
+        </w:rPr>
+        <w:t>"\Projeto-Classificadores\Main_Project\ResNet\Results\Experimento 13 - ResNet\Experimento 13- Pycharm LOG.txt"</w:t>
       </w:r>
     </w:p>
     <w:p>
@@ -5611,15 +4854,7 @@
         <w:t xml:space="preserve">deste experimento é </w:t>
       </w:r>
       <w:r>
-        <w:t xml:space="preserve">repetir o experimento 13 ampliando consideravelmente a quantidade de épocas, tentando novamente alcançar um platô nos resultados, utilizando a configuração que obteve a maior eficiência dentre os experimentos anteriores (Variante 18 com Batch </w:t>
-      </w:r>
-      <w:proofErr w:type="spellStart"/>
-      <w:r>
-        <w:t>Size</w:t>
-      </w:r>
-      <w:proofErr w:type="spellEnd"/>
-      <w:r>
-        <w:t xml:space="preserve"> = 32)</w:t>
+        <w:t>repetir o experimento 13 ampliando consideravelmente a quantidade de épocas, tentando novamente alcançar um platô nos resultados, utilizando a configuração que obteve a maior eficiência dentre os experimentos anteriores (Variante 18 com Batch Size = 32)</w:t>
       </w:r>
     </w:p>
     <w:p>
@@ -5776,64 +5011,14 @@
           <w:iCs/>
           <w:color w:val="000000" w:themeColor="text1"/>
         </w:rPr>
-        <w:t xml:space="preserve">Logs do </w:t>
-      </w:r>
-      <w:proofErr w:type="spellStart"/>
+        <w:t xml:space="preserve">Logs do Pycharm estão localizados em </w:t>
+      </w:r>
       <w:r>
         <w:rPr>
           <w:i/>
           <w:iCs/>
-          <w:color w:val="000000" w:themeColor="text1"/>
-        </w:rPr>
-        <w:t>Pycharm</w:t>
-      </w:r>
-      <w:proofErr w:type="spellEnd"/>
-      <w:r>
-        <w:rPr>
-          <w:i/>
-          <w:iCs/>
-          <w:color w:val="000000" w:themeColor="text1"/>
-        </w:rPr>
-        <w:t xml:space="preserve"> estão localizados em </w:t>
-      </w:r>
-      <w:r>
-        <w:rPr>
-          <w:i/>
-          <w:iCs/>
-        </w:rPr>
-        <w:t xml:space="preserve">"\Projeto-Classificadores\Main_Project\ResNet\Results\Experimento 14 - </w:t>
-      </w:r>
-      <w:proofErr w:type="spellStart"/>
-      <w:r>
-        <w:rPr>
-          <w:i/>
-          <w:iCs/>
-        </w:rPr>
-        <w:t>ResNet</w:t>
-      </w:r>
-      <w:proofErr w:type="spellEnd"/>
-      <w:r>
-        <w:rPr>
-          <w:i/>
-          <w:iCs/>
-        </w:rPr>
-        <w:t xml:space="preserve">\Experimento 14- </w:t>
-      </w:r>
-      <w:proofErr w:type="spellStart"/>
-      <w:r>
-        <w:rPr>
-          <w:i/>
-          <w:iCs/>
-        </w:rPr>
-        <w:t>Pycharm</w:t>
-      </w:r>
-      <w:proofErr w:type="spellEnd"/>
-      <w:r>
-        <w:rPr>
-          <w:i/>
-          <w:iCs/>
-        </w:rPr>
-        <w:t xml:space="preserve"> LOG.txt"</w:t>
+        </w:rPr>
+        <w:t>"\Projeto-Classificadores\Main_Project\ResNet\Results\Experimento 14 - ResNet\Experimento 14- Pycharm LOG.txt"</w:t>
       </w:r>
     </w:p>
     <w:p>
@@ -5905,6 +5090,83 @@
         </w:rPr>
         <w:t>EXPERIMENTO 17 (RESNET) – TESTE DE 500 ÉPOCAS COM RESNET10 E BS = 32</w:t>
       </w:r>
+    </w:p>
+    <w:p>
+      <w:pPr>
+        <w:pStyle w:val="PargrafodaLista"/>
+        <w:numPr>
+          <w:ilvl w:val="0"/>
+          <w:numId w:val="1"/>
+        </w:numPr>
+        <w:jc w:val="both"/>
+        <w:rPr>
+          <w:b/>
+          <w:bCs/>
+        </w:rPr>
+      </w:pPr>
+      <w:r>
+        <w:rPr>
+          <w:b/>
+          <w:bCs/>
+        </w:rPr>
+        <w:t>EXPERIMENTO 1</w:t>
+      </w:r>
+      <w:r>
+        <w:rPr>
+          <w:b/>
+          <w:bCs/>
+        </w:rPr>
+        <w:t>8</w:t>
+      </w:r>
+      <w:r>
+        <w:rPr>
+          <w:b/>
+          <w:bCs/>
+        </w:rPr>
+        <w:t xml:space="preserve"> (RESNET) – TESTE DE </w:t>
+      </w:r>
+      <w:r>
+        <w:rPr>
+          <w:b/>
+          <w:bCs/>
+        </w:rPr>
+        <w:t>3000</w:t>
+      </w:r>
+      <w:r>
+        <w:rPr>
+          <w:b/>
+          <w:bCs/>
+        </w:rPr>
+        <w:t xml:space="preserve"> ÉPOCAS COM RESNET</w:t>
+      </w:r>
+      <w:r>
+        <w:rPr>
+          <w:b/>
+          <w:bCs/>
+        </w:rPr>
+        <w:t>34</w:t>
+      </w:r>
+      <w:r>
+        <w:rPr>
+          <w:b/>
+          <w:bCs/>
+        </w:rPr>
+        <w:t xml:space="preserve"> E BS = 32</w:t>
+      </w:r>
+    </w:p>
+    <w:p>
+      <w:pPr>
+        <w:pStyle w:val="PargrafodaLista"/>
+        <w:numPr>
+          <w:ilvl w:val="0"/>
+          <w:numId w:val="1"/>
+        </w:numPr>
+        <w:jc w:val="both"/>
+        <w:rPr>
+          <w:b/>
+          <w:bCs/>
+        </w:rPr>
+      </w:pPr>
     </w:p>
     <w:p>
       <w:pPr>
@@ -6027,7 +5289,7 @@
         <v:path o:extrusionok="f" gradientshapeok="t" o:connecttype="rect"/>
         <o:lock v:ext="edit" aspectratio="t"/>
       </v:shapetype>
-      <v:shape id="_x0000_i1181" type="#_x0000_t75" style="width:693.1pt;height:487.7pt;visibility:visible;mso-wrap-style:square" o:bullet="t">
+      <v:shape id="_x0000_i1029" type="#_x0000_t75" style="width:693.1pt;height:487.7pt;visibility:visible;mso-wrap-style:square" o:bullet="t">
         <v:imagedata r:id="rId1" o:title="" croptop="19686f" cropbottom="43833f" cropleft="8606f" cropright="55951f"/>
       </v:shape>
     </w:pict>

</xml_diff>

<commit_message>
Atualização das documentações 13/04
</commit_message>
<xml_diff>
--- a/Documents and Backups/Documentacao ResNet.docx
+++ b/Documents and Backups/Documentacao ResNet.docx
@@ -100,12 +100,53 @@
       <w:r>
         <w:t xml:space="preserve"> Artigo de referência - </w:t>
       </w:r>
-      <w:r>
-        <w:rPr>
-          <w:i/>
-          <w:iCs/>
-        </w:rPr>
-        <w:t>Deep Residual Learning for Image Recognition.</w:t>
+      <w:proofErr w:type="spellStart"/>
+      <w:r>
+        <w:rPr>
+          <w:i/>
+          <w:iCs/>
+        </w:rPr>
+        <w:t>Deep</w:t>
+      </w:r>
+      <w:proofErr w:type="spellEnd"/>
+      <w:r>
+        <w:rPr>
+          <w:i/>
+          <w:iCs/>
+        </w:rPr>
+        <w:t xml:space="preserve"> Residual Learning for </w:t>
+      </w:r>
+      <w:proofErr w:type="spellStart"/>
+      <w:r>
+        <w:rPr>
+          <w:i/>
+          <w:iCs/>
+        </w:rPr>
+        <w:t>Image</w:t>
+      </w:r>
+      <w:proofErr w:type="spellEnd"/>
+      <w:r>
+        <w:rPr>
+          <w:i/>
+          <w:iCs/>
+        </w:rPr>
+        <w:t xml:space="preserve"> </w:t>
+      </w:r>
+      <w:proofErr w:type="spellStart"/>
+      <w:r>
+        <w:rPr>
+          <w:i/>
+          <w:iCs/>
+        </w:rPr>
+        <w:t>Recognition</w:t>
+      </w:r>
+      <w:proofErr w:type="spellEnd"/>
+      <w:r>
+        <w:rPr>
+          <w:i/>
+          <w:iCs/>
+        </w:rPr>
+        <w:t>.</w:t>
       </w:r>
     </w:p>
     <w:p>
@@ -131,6 +172,7 @@
       <w:r>
         <w:t xml:space="preserve">Foi utilizada a base ImageNet1K no formato </w:t>
       </w:r>
+      <w:proofErr w:type="spellStart"/>
       <w:r>
         <w:rPr>
           <w:i/>
@@ -138,9 +180,11 @@
         </w:rPr>
         <w:t>TFRecords</w:t>
       </w:r>
+      <w:proofErr w:type="spellEnd"/>
       <w:r>
         <w:t xml:space="preserve">, um formato binário de serialização do </w:t>
       </w:r>
+      <w:proofErr w:type="spellStart"/>
       <w:r>
         <w:rPr>
           <w:i/>
@@ -148,6 +192,7 @@
         </w:rPr>
         <w:t>TensorFlow</w:t>
       </w:r>
+      <w:proofErr w:type="spellEnd"/>
       <w:r>
         <w:t xml:space="preserve"> projetado para armazenar exemplos (imagem + rótulo) de forma eficiente e compacta.</w:t>
       </w:r>
@@ -265,6 +310,7 @@
       <w:r>
         <w:t xml:space="preserve"> partir da imagem redimensionada, é extraído aleatoriamente um </w:t>
       </w:r>
+      <w:proofErr w:type="spellStart"/>
       <w:r>
         <w:rPr>
           <w:i/>
@@ -272,9 +318,11 @@
         </w:rPr>
         <w:t>crop</w:t>
       </w:r>
+      <w:proofErr w:type="spellEnd"/>
       <w:r>
         <w:t xml:space="preserve"> de tamanho 224×224, compatível com o tamanho de entrada da </w:t>
       </w:r>
+      <w:proofErr w:type="spellStart"/>
       <w:r>
         <w:rPr>
           <w:i/>
@@ -282,6 +330,7 @@
         </w:rPr>
         <w:t>ResNet</w:t>
       </w:r>
+      <w:proofErr w:type="spellEnd"/>
       <w:r>
         <w:t>.</w:t>
       </w:r>
@@ -296,7 +345,15 @@
         <w:jc w:val="both"/>
       </w:pPr>
       <w:r>
-        <w:t xml:space="preserve">Antes da extração do crop, pode-se aplicar opcionalmente um espelhamento horizontal (horizontal flip) na imagem </w:t>
+        <w:t xml:space="preserve">Antes da extração do </w:t>
+      </w:r>
+      <w:proofErr w:type="spellStart"/>
+      <w:r>
+        <w:t>crop</w:t>
+      </w:r>
+      <w:proofErr w:type="spellEnd"/>
+      <w:r>
+        <w:t xml:space="preserve">, pode-se aplicar opcionalmente um espelhamento horizontal (horizontal flip) na imagem </w:t>
       </w:r>
     </w:p>
     <w:p>
@@ -314,6 +371,7 @@
       <w:r>
         <w:t xml:space="preserve">pós o </w:t>
       </w:r>
+      <w:proofErr w:type="spellStart"/>
       <w:r>
         <w:rPr>
           <w:i/>
@@ -321,6 +379,7 @@
         </w:rPr>
         <w:t>crop</w:t>
       </w:r>
+      <w:proofErr w:type="spellEnd"/>
       <w:r>
         <w:t>, é realizada a normalização dos pixels segundo a expressão:</w:t>
       </w:r>
@@ -389,6 +448,7 @@
         </w:numPr>
         <w:jc w:val="both"/>
       </w:pPr>
+      <w:proofErr w:type="spellStart"/>
       <w:r>
         <w:rPr>
           <w:b/>
@@ -399,9 +459,11 @@
         </w:rPr>
         <w:t>imagenet_mean</w:t>
       </w:r>
+      <w:proofErr w:type="spellEnd"/>
       <w:r>
         <w:t xml:space="preserve"> e </w:t>
       </w:r>
+      <w:proofErr w:type="spellStart"/>
       <w:r>
         <w:rPr>
           <w:b/>
@@ -412,9 +474,11 @@
         </w:rPr>
         <w:t>imagenet_std</w:t>
       </w:r>
+      <w:proofErr w:type="spellEnd"/>
       <w:r>
         <w:t xml:space="preserve"> correspondem à média e ao desvio padrão calculados a partir do conjunto </w:t>
       </w:r>
+      <w:proofErr w:type="spellStart"/>
       <w:r>
         <w:rPr>
           <w:i/>
@@ -422,6 +486,7 @@
         </w:rPr>
         <w:t>ImageNet</w:t>
       </w:r>
+      <w:proofErr w:type="spellEnd"/>
       <w:r>
         <w:t xml:space="preserve">. Essa normalização é aplicada </w:t>
       </w:r>
@@ -463,16 +528,42 @@
       <w:r>
         <w:t xml:space="preserve"> Existe uma diferença de implementação entre o </w:t>
       </w:r>
-      <w:r>
-        <w:rPr>
-          <w:i/>
-          <w:iCs/>
-        </w:rPr>
-        <w:t>framwork ‘Caffe’</w:t>
+      <w:proofErr w:type="spellStart"/>
+      <w:r>
+        <w:rPr>
+          <w:i/>
+          <w:iCs/>
+        </w:rPr>
+        <w:t>framwork</w:t>
+      </w:r>
+      <w:proofErr w:type="spellEnd"/>
+      <w:r>
+        <w:rPr>
+          <w:i/>
+          <w:iCs/>
+        </w:rPr>
+        <w:t xml:space="preserve"> ‘</w:t>
+      </w:r>
+      <w:proofErr w:type="spellStart"/>
+      <w:r>
+        <w:rPr>
+          <w:i/>
+          <w:iCs/>
+        </w:rPr>
+        <w:t>Caffe</w:t>
+      </w:r>
+      <w:proofErr w:type="spellEnd"/>
+      <w:r>
+        <w:rPr>
+          <w:i/>
+          <w:iCs/>
+        </w:rPr>
+        <w:t>’</w:t>
       </w:r>
       <w:r>
         <w:t xml:space="preserve"> utilizado pelos autores e o </w:t>
       </w:r>
+      <w:proofErr w:type="spellStart"/>
       <w:r>
         <w:rPr>
           <w:i/>
@@ -480,6 +571,7 @@
         </w:rPr>
         <w:t>Tensorflow</w:t>
       </w:r>
+      <w:proofErr w:type="spellEnd"/>
     </w:p>
     <w:p>
       <w:pPr>
@@ -690,8 +782,21 @@
         </w:numPr>
         <w:jc w:val="both"/>
       </w:pPr>
-      <w:r>
-        <w:t>Weight Decay – 1e-4 (na prática aplicado como L2 em kernels)</w:t>
+      <w:proofErr w:type="spellStart"/>
+      <w:r>
+        <w:t>Weight</w:t>
+      </w:r>
+      <w:proofErr w:type="spellEnd"/>
+      <w:r>
+        <w:t xml:space="preserve"> </w:t>
+      </w:r>
+      <w:proofErr w:type="spellStart"/>
+      <w:r>
+        <w:t>Decay</w:t>
+      </w:r>
+      <w:proofErr w:type="spellEnd"/>
+      <w:r>
+        <w:t xml:space="preserve"> – 1e-4 (na prática aplicado como L2 em kernels)</w:t>
       </w:r>
     </w:p>
     <w:p>
@@ -716,14 +821,40 @@
         </w:numPr>
         <w:jc w:val="both"/>
       </w:pPr>
-      <w:r>
-        <w:t>SparseCategoricalCrossentropy(...) — os rótulos da ImageNet</w:t>
-      </w:r>
+      <w:proofErr w:type="spellStart"/>
+      <w:r>
+        <w:t>SparseCategoricalCrossentropy</w:t>
+      </w:r>
+      <w:proofErr w:type="spellEnd"/>
+      <w:r>
+        <w:t xml:space="preserve">(...) — os rótulos da </w:t>
+      </w:r>
+      <w:proofErr w:type="spellStart"/>
+      <w:r>
+        <w:t>ImageNet</w:t>
+      </w:r>
+      <w:proofErr w:type="spellEnd"/>
       <w:r>
         <w:t xml:space="preserve"> </w:t>
       </w:r>
       <w:r>
-        <w:t xml:space="preserve">são inteiros, então sparse é o loss apropriado </w:t>
+        <w:t xml:space="preserve">são inteiros, então </w:t>
+      </w:r>
+      <w:proofErr w:type="spellStart"/>
+      <w:r>
+        <w:t>sparse</w:t>
+      </w:r>
+      <w:proofErr w:type="spellEnd"/>
+      <w:r>
+        <w:t xml:space="preserve"> é o </w:t>
+      </w:r>
+      <w:proofErr w:type="spellStart"/>
+      <w:r>
+        <w:t>loss</w:t>
+      </w:r>
+      <w:proofErr w:type="spellEnd"/>
+      <w:r>
+        <w:t xml:space="preserve"> apropriado </w:t>
       </w:r>
     </w:p>
     <w:p>
@@ -736,13 +867,37 @@
         <w:jc w:val="both"/>
       </w:pPr>
       <w:r>
-        <w:t>Métricas de treinamento utilziadas foram</w:t>
+        <w:t xml:space="preserve">Métricas de treinamento </w:t>
+      </w:r>
+      <w:proofErr w:type="spellStart"/>
+      <w:r>
+        <w:t>utilziadas</w:t>
+      </w:r>
+      <w:proofErr w:type="spellEnd"/>
+      <w:r>
+        <w:t xml:space="preserve"> foram</w:t>
       </w:r>
       <w:r>
         <w:t xml:space="preserve"> –</w:t>
       </w:r>
       <w:r>
-        <w:t xml:space="preserve"> accuracy (top-1) e SparseTopKCategoricalAccuracy(k=5) (top-5).</w:t>
+        <w:t xml:space="preserve"> </w:t>
+      </w:r>
+      <w:proofErr w:type="spellStart"/>
+      <w:r>
+        <w:t>accuracy</w:t>
+      </w:r>
+      <w:proofErr w:type="spellEnd"/>
+      <w:r>
+        <w:t xml:space="preserve"> (top-1) e </w:t>
+      </w:r>
+      <w:proofErr w:type="spellStart"/>
+      <w:r>
+        <w:t>SparseTopKCategoricalAccuracy</w:t>
+      </w:r>
+      <w:proofErr w:type="spellEnd"/>
+      <w:r>
+        <w:t>(k=5) (top-5).</w:t>
       </w:r>
     </w:p>
     <w:p>
@@ -1039,7 +1194,39 @@
         <w:t xml:space="preserve">Resultados: </w:t>
       </w:r>
       <w:r>
-        <w:t>Os Logs do Pycharm estão localizados em "\Projetos do Mestrado (Git)\Projeto-Classificadores\Main_Validation\ResNet-50\Results\Experimento 1 - ResNet\Experimento 1 -RN- Sanity Check - LOG"</w:t>
+        <w:t xml:space="preserve">Os Logs do </w:t>
+      </w:r>
+      <w:proofErr w:type="spellStart"/>
+      <w:r>
+        <w:t>Pycharm</w:t>
+      </w:r>
+      <w:proofErr w:type="spellEnd"/>
+      <w:r>
+        <w:t xml:space="preserve"> estão localizados em "\Projetos do Mestrado (Git)\Projeto-Classificadores\Main_Validation\ResNet-50\Results\Experimento 1 - </w:t>
+      </w:r>
+      <w:proofErr w:type="spellStart"/>
+      <w:r>
+        <w:t>ResNet</w:t>
+      </w:r>
+      <w:proofErr w:type="spellEnd"/>
+      <w:r>
+        <w:t xml:space="preserve">\Experimento 1 -RN- </w:t>
+      </w:r>
+      <w:proofErr w:type="spellStart"/>
+      <w:r>
+        <w:t>Sanity</w:t>
+      </w:r>
+      <w:proofErr w:type="spellEnd"/>
+      <w:r>
+        <w:t xml:space="preserve"> </w:t>
+      </w:r>
+      <w:proofErr w:type="spellStart"/>
+      <w:r>
+        <w:t>Check</w:t>
+      </w:r>
+      <w:proofErr w:type="spellEnd"/>
+      <w:r>
+        <w:t xml:space="preserve"> - LOG"</w:t>
       </w:r>
     </w:p>
     <w:p>
@@ -1271,7 +1458,23 @@
           <w:sz w:val="18"/>
           <w:szCs w:val="18"/>
         </w:rPr>
-        <w:t>do experimento 2 (ResNet)</w:t>
+        <w:t>do experimento 2 (</w:t>
+      </w:r>
+      <w:proofErr w:type="spellStart"/>
+      <w:r>
+        <w:rPr>
+          <w:sz w:val="18"/>
+          <w:szCs w:val="18"/>
+        </w:rPr>
+        <w:t>ResNet</w:t>
+      </w:r>
+      <w:proofErr w:type="spellEnd"/>
+      <w:r>
+        <w:rPr>
+          <w:sz w:val="18"/>
+          <w:szCs w:val="18"/>
+        </w:rPr>
+        <w:t>)</w:t>
       </w:r>
       <w:r>
         <w:rPr>
@@ -1372,12 +1575,30 @@
           <w:iCs/>
           <w:color w:val="000000" w:themeColor="text1"/>
         </w:rPr>
-        <w:t xml:space="preserve">Logs do Pycharm </w:t>
-      </w:r>
-      <w:r>
-        <w:rPr>
+        <w:t xml:space="preserve">Logs do </w:t>
+      </w:r>
+      <w:proofErr w:type="spellStart"/>
+      <w:r>
+        <w:rPr>
+          <w:i/>
+          <w:iCs/>
           <w:color w:val="000000" w:themeColor="text1"/>
         </w:rPr>
+        <w:t>Pycharm</w:t>
+      </w:r>
+      <w:proofErr w:type="spellEnd"/>
+      <w:r>
+        <w:rPr>
+          <w:i/>
+          <w:iCs/>
+          <w:color w:val="000000" w:themeColor="text1"/>
+        </w:rPr>
+        <w:t xml:space="preserve"> </w:t>
+      </w:r>
+      <w:r>
+        <w:rPr>
+          <w:color w:val="000000" w:themeColor="text1"/>
+        </w:rPr>
         <w:t xml:space="preserve">estão </w:t>
       </w:r>
       <w:r>
@@ -1386,7 +1607,61 @@
           <w:iCs/>
           <w:color w:val="000000" w:themeColor="text1"/>
         </w:rPr>
-        <w:t>localizados em "\Projeto-Classificadores\Main_Project\ResNet50\Results\Experimento 2 - ResNet\Experimento 2 -RN- Sanity Check - LOG.txt"</w:t>
+        <w:t xml:space="preserve">localizados em "\Projeto-Classificadores\Main_Project\ResNet50\Results\Experimento 2 - </w:t>
+      </w:r>
+      <w:proofErr w:type="spellStart"/>
+      <w:r>
+        <w:rPr>
+          <w:i/>
+          <w:iCs/>
+          <w:color w:val="000000" w:themeColor="text1"/>
+        </w:rPr>
+        <w:t>ResNet</w:t>
+      </w:r>
+      <w:proofErr w:type="spellEnd"/>
+      <w:r>
+        <w:rPr>
+          <w:i/>
+          <w:iCs/>
+          <w:color w:val="000000" w:themeColor="text1"/>
+        </w:rPr>
+        <w:t xml:space="preserve">\Experimento 2 -RN- </w:t>
+      </w:r>
+      <w:proofErr w:type="spellStart"/>
+      <w:r>
+        <w:rPr>
+          <w:i/>
+          <w:iCs/>
+          <w:color w:val="000000" w:themeColor="text1"/>
+        </w:rPr>
+        <w:t>Sanity</w:t>
+      </w:r>
+      <w:proofErr w:type="spellEnd"/>
+      <w:r>
+        <w:rPr>
+          <w:i/>
+          <w:iCs/>
+          <w:color w:val="000000" w:themeColor="text1"/>
+        </w:rPr>
+        <w:t xml:space="preserve"> </w:t>
+      </w:r>
+      <w:proofErr w:type="spellStart"/>
+      <w:r>
+        <w:rPr>
+          <w:i/>
+          <w:iCs/>
+          <w:color w:val="000000" w:themeColor="text1"/>
+        </w:rPr>
+        <w:t>Check</w:t>
+      </w:r>
+      <w:proofErr w:type="spellEnd"/>
+      <w:r>
+        <w:rPr>
+          <w:i/>
+          <w:iCs/>
+          <w:color w:val="000000" w:themeColor="text1"/>
+        </w:rPr>
+        <w:t xml:space="preserve"> - LOG.txt"</w:t>
       </w:r>
     </w:p>
     <w:p>
@@ -1427,7 +1702,87 @@
           <w:i/>
           <w:iCs/>
         </w:rPr>
-        <w:t xml:space="preserve"> Os warnings extensos presentes no arquivo de log relacionados a while_loop, StatelessRandomUniform, ImageProjectiveTransformV3 e AdjustContrastv2 não representam um problema funcional. Eles indicam apenas que o TensorFlow está encapsulando operações de data augmentation estocástico em laços internos por limitações do conversor de grafo. </w:t>
+        <w:t xml:space="preserve"> Os </w:t>
+      </w:r>
+      <w:proofErr w:type="spellStart"/>
+      <w:r>
+        <w:rPr>
+          <w:i/>
+          <w:iCs/>
+        </w:rPr>
+        <w:t>warnings</w:t>
+      </w:r>
+      <w:proofErr w:type="spellEnd"/>
+      <w:r>
+        <w:rPr>
+          <w:i/>
+          <w:iCs/>
+        </w:rPr>
+        <w:t xml:space="preserve"> extensos presentes no arquivo de log relacionados a </w:t>
+      </w:r>
+      <w:proofErr w:type="spellStart"/>
+      <w:r>
+        <w:rPr>
+          <w:i/>
+          <w:iCs/>
+        </w:rPr>
+        <w:t>while_loop</w:t>
+      </w:r>
+      <w:proofErr w:type="spellEnd"/>
+      <w:r>
+        <w:rPr>
+          <w:i/>
+          <w:iCs/>
+        </w:rPr>
+        <w:t xml:space="preserve">, </w:t>
+      </w:r>
+      <w:proofErr w:type="spellStart"/>
+      <w:r>
+        <w:rPr>
+          <w:i/>
+          <w:iCs/>
+        </w:rPr>
+        <w:t>StatelessRandomUniform</w:t>
+      </w:r>
+      <w:proofErr w:type="spellEnd"/>
+      <w:r>
+        <w:rPr>
+          <w:i/>
+          <w:iCs/>
+        </w:rPr>
+        <w:t xml:space="preserve">, ImageProjectiveTransformV3 e AdjustContrastv2 não representam um problema funcional. Eles indicam apenas que o </w:t>
+      </w:r>
+      <w:proofErr w:type="spellStart"/>
+      <w:r>
+        <w:rPr>
+          <w:i/>
+          <w:iCs/>
+        </w:rPr>
+        <w:t>TensorFlow</w:t>
+      </w:r>
+      <w:proofErr w:type="spellEnd"/>
+      <w:r>
+        <w:rPr>
+          <w:i/>
+          <w:iCs/>
+        </w:rPr>
+        <w:t xml:space="preserve"> está encapsulando operações de data </w:t>
+      </w:r>
+      <w:proofErr w:type="spellStart"/>
+      <w:r>
+        <w:rPr>
+          <w:i/>
+          <w:iCs/>
+        </w:rPr>
+        <w:t>augmentation</w:t>
+      </w:r>
+      <w:proofErr w:type="spellEnd"/>
+      <w:r>
+        <w:rPr>
+          <w:i/>
+          <w:iCs/>
+        </w:rPr>
+        <w:t xml:space="preserve"> estocástico em laços internos por limitações do conversor de grafo. </w:t>
       </w:r>
     </w:p>
     <w:p>
@@ -1464,6 +1819,7 @@
       <w:r>
         <w:t xml:space="preserve">Apesar da </w:t>
       </w:r>
+      <w:proofErr w:type="spellStart"/>
       <w:r>
         <w:rPr>
           <w:i/>
@@ -1471,6 +1827,7 @@
         </w:rPr>
         <w:t>loss</w:t>
       </w:r>
+      <w:proofErr w:type="spellEnd"/>
       <w:r>
         <w:t xml:space="preserve"> de validação apresentar uma leve redução ao longo das épocas, a acurácia</w:t>
       </w:r>
@@ -1575,6 +1932,7 @@
       <w:r>
         <w:t xml:space="preserve">Do ponto de vista funcional, o </w:t>
       </w:r>
+      <w:proofErr w:type="spellStart"/>
       <w:r>
         <w:rPr>
           <w:i/>
@@ -1582,6 +1940,7 @@
         </w:rPr>
         <w:t>DataLoader</w:t>
       </w:r>
+      <w:proofErr w:type="spellEnd"/>
       <w:r>
         <w:t xml:space="preserve"> </w:t>
       </w:r>
@@ -1597,6 +1956,7 @@
       <w:r>
         <w:t xml:space="preserve">: ele carrega imagens, cria splits treino/validação, aplica </w:t>
       </w:r>
+      <w:proofErr w:type="spellStart"/>
       <w:r>
         <w:rPr>
           <w:i/>
@@ -1604,9 +1964,11 @@
         </w:rPr>
         <w:t>augmentations</w:t>
       </w:r>
+      <w:proofErr w:type="spellEnd"/>
       <w:r>
         <w:t xml:space="preserve">, normaliza os pixels e entrega </w:t>
       </w:r>
+      <w:proofErr w:type="spellStart"/>
       <w:r>
         <w:rPr>
           <w:i/>
@@ -1614,6 +1976,7 @@
         </w:rPr>
         <w:t>tf.data.Dataset</w:t>
       </w:r>
+      <w:proofErr w:type="spellEnd"/>
       <w:r>
         <w:t xml:space="preserve"> válidos</w:t>
       </w:r>
@@ -1623,6 +1986,7 @@
       <w:r>
         <w:t xml:space="preserve">No entanto, do ponto de vista metodológico e estatístico, esse </w:t>
       </w:r>
+      <w:proofErr w:type="spellStart"/>
       <w:r>
         <w:rPr>
           <w:i/>
@@ -1630,6 +1994,7 @@
         </w:rPr>
         <w:t>loader</w:t>
       </w:r>
+      <w:proofErr w:type="spellEnd"/>
       <w:r>
         <w:t xml:space="preserve"> não </w:t>
       </w:r>
@@ -1690,6 +2055,7 @@
       <w:r>
         <w:t xml:space="preserve">uso de </w:t>
       </w:r>
+      <w:proofErr w:type="spellStart"/>
       <w:r>
         <w:rPr>
           <w:i/>
@@ -1697,9 +2063,11 @@
         </w:rPr>
         <w:t>image_dataset_from_directory</w:t>
       </w:r>
+      <w:proofErr w:type="spellEnd"/>
       <w:r>
         <w:t xml:space="preserve"> com </w:t>
       </w:r>
+      <w:proofErr w:type="spellStart"/>
       <w:r>
         <w:rPr>
           <w:i/>
@@ -1707,9 +2075,11 @@
         </w:rPr>
         <w:t>validation_split</w:t>
       </w:r>
+      <w:proofErr w:type="spellEnd"/>
       <w:r>
         <w:t xml:space="preserve"> no mesmo diretório raiz. Esse método assume que todas as classes estão perfeitamente balanceadas e distribuídas de forma aleatória no </w:t>
       </w:r>
+      <w:proofErr w:type="spellStart"/>
       <w:r>
         <w:rPr>
           <w:i/>
@@ -1717,9 +2087,11 @@
         </w:rPr>
         <w:t>filesystem</w:t>
       </w:r>
+      <w:proofErr w:type="spellEnd"/>
       <w:r>
         <w:t xml:space="preserve">, o que raramente é verdade em </w:t>
       </w:r>
+      <w:proofErr w:type="spellStart"/>
       <w:r>
         <w:rPr>
           <w:i/>
@@ -1727,9 +2099,11 @@
         </w:rPr>
         <w:t>datasets</w:t>
       </w:r>
+      <w:proofErr w:type="spellEnd"/>
       <w:r>
         <w:t xml:space="preserve"> reais. O split é feito por ordem interna do </w:t>
       </w:r>
+      <w:proofErr w:type="spellStart"/>
       <w:r>
         <w:rPr>
           <w:i/>
@@ -1737,6 +2111,7 @@
         </w:rPr>
         <w:t>loader</w:t>
       </w:r>
+      <w:proofErr w:type="spellEnd"/>
       <w:r>
         <w:t>, não por semântica da classe.</w:t>
       </w:r>
@@ -1770,6 +2145,7 @@
       <w:r>
         <w:t xml:space="preserve"> aplicação de </w:t>
       </w:r>
+      <w:proofErr w:type="spellStart"/>
       <w:r>
         <w:rPr>
           <w:i/>
@@ -1777,6 +2153,7 @@
         </w:rPr>
         <w:t>augmentations</w:t>
       </w:r>
+      <w:proofErr w:type="spellEnd"/>
       <w:r>
         <w:t xml:space="preserve"> pesadas apenas no treino, enquanto a validação recebe imagens apenas redimensionadas e </w:t>
       </w:r>
@@ -1833,6 +2210,7 @@
       <w:r>
         <w:t xml:space="preserve">fixação de </w:t>
       </w:r>
+      <w:proofErr w:type="spellStart"/>
       <w:r>
         <w:rPr>
           <w:i/>
@@ -1840,9 +2218,11 @@
         </w:rPr>
         <w:t>steps_per_epoch</w:t>
       </w:r>
+      <w:proofErr w:type="spellEnd"/>
       <w:r>
         <w:t xml:space="preserve"> e </w:t>
       </w:r>
+      <w:proofErr w:type="spellStart"/>
       <w:r>
         <w:rPr>
           <w:i/>
@@ -1850,9 +2230,11 @@
         </w:rPr>
         <w:t>validation_steps</w:t>
       </w:r>
+      <w:proofErr w:type="spellEnd"/>
       <w:r>
         <w:t xml:space="preserve"> manualmente no trainer, enquanto o </w:t>
       </w:r>
+      <w:proofErr w:type="spellStart"/>
       <w:r>
         <w:rPr>
           <w:i/>
@@ -1860,9 +2242,11 @@
         </w:rPr>
         <w:t>DataLoader</w:t>
       </w:r>
+      <w:proofErr w:type="spellEnd"/>
       <w:r>
         <w:t xml:space="preserve"> já entrega </w:t>
       </w:r>
+      <w:proofErr w:type="spellStart"/>
       <w:r>
         <w:rPr>
           <w:i/>
@@ -1870,9 +2254,11 @@
         </w:rPr>
         <w:t>datasets</w:t>
       </w:r>
+      <w:proofErr w:type="spellEnd"/>
       <w:r>
         <w:t xml:space="preserve"> com cardinalidade definida. Isso cria uma situação em que o </w:t>
       </w:r>
+      <w:proofErr w:type="spellStart"/>
       <w:r>
         <w:rPr>
           <w:i/>
@@ -1880,6 +2266,7 @@
         </w:rPr>
         <w:t>Keras</w:t>
       </w:r>
+      <w:proofErr w:type="spellEnd"/>
       <w:r>
         <w:t xml:space="preserve"> não está necessariamente avaliando todas as amostras de validação, e pode estar avaliando batches repetidos ou truncados. </w:t>
       </w:r>
@@ -1912,6 +2299,7 @@
       <w:r>
         <w:t xml:space="preserve">Os scripts de carregamento de dados foram reescritos, evitando os erros previamente discutidos. Adicionalmente, as funções definidas para divisão correta da base de dados foram alocadas no arquivo Utils.py, separando-a do arquivo </w:t>
       </w:r>
+      <w:proofErr w:type="spellStart"/>
       <w:r>
         <w:rPr>
           <w:i/>
@@ -1920,6 +2308,7 @@
         </w:rPr>
         <w:t>DataLoader</w:t>
       </w:r>
+      <w:proofErr w:type="spellEnd"/>
       <w:r>
         <w:t xml:space="preserve"> específico da arquitetura. Agora, a estrutura esperada segue conforme ilustrado pela figura </w:t>
       </w:r>
@@ -2059,7 +2448,39 @@
         <w:t xml:space="preserve">Resultados: </w:t>
       </w:r>
       <w:r>
-        <w:t>Os Logs do Pycharm estão localizados em "\Projeto-Classificadores\Main_Project\ResNet50\Results\Experimento 3 - ResNet\Experimento 3 -RN- Sanity Check - LOG.txt"</w:t>
+        <w:t xml:space="preserve">Os Logs do </w:t>
+      </w:r>
+      <w:proofErr w:type="spellStart"/>
+      <w:r>
+        <w:t>Pycharm</w:t>
+      </w:r>
+      <w:proofErr w:type="spellEnd"/>
+      <w:r>
+        <w:t xml:space="preserve"> estão localizados em "\Projeto-Classificadores\Main_Project\ResNet50\Results\Experimento 3 - </w:t>
+      </w:r>
+      <w:proofErr w:type="spellStart"/>
+      <w:r>
+        <w:t>ResNet</w:t>
+      </w:r>
+      <w:proofErr w:type="spellEnd"/>
+      <w:r>
+        <w:t xml:space="preserve">\Experimento 3 -RN- </w:t>
+      </w:r>
+      <w:proofErr w:type="spellStart"/>
+      <w:r>
+        <w:t>Sanity</w:t>
+      </w:r>
+      <w:proofErr w:type="spellEnd"/>
+      <w:r>
+        <w:t xml:space="preserve"> </w:t>
+      </w:r>
+      <w:proofErr w:type="spellStart"/>
+      <w:r>
+        <w:t>Check</w:t>
+      </w:r>
+      <w:proofErr w:type="spellEnd"/>
+      <w:r>
+        <w:t xml:space="preserve"> - LOG.txt"</w:t>
       </w:r>
     </w:p>
     <w:p>
@@ -2092,7 +2513,23 @@
           <w:b/>
           <w:bCs/>
         </w:rPr>
-        <w:t xml:space="preserve">Testes voltados à exploração de hiperparâmetros </w:t>
+        <w:t xml:space="preserve">Testes voltados à exploração de </w:t>
+      </w:r>
+      <w:proofErr w:type="spellStart"/>
+      <w:r>
+        <w:rPr>
+          <w:b/>
+          <w:bCs/>
+        </w:rPr>
+        <w:t>hiperparâmetros</w:t>
+      </w:r>
+      <w:proofErr w:type="spellEnd"/>
+      <w:r>
+        <w:rPr>
+          <w:b/>
+          <w:bCs/>
+        </w:rPr>
+        <w:t xml:space="preserve"> </w:t>
       </w:r>
       <w:r>
         <w:rPr>
@@ -2167,6 +2604,7 @@
       <w:r>
         <w:t xml:space="preserve"> </w:t>
       </w:r>
+      <w:proofErr w:type="spellStart"/>
       <w:r>
         <w:rPr>
           <w:i/>
@@ -2174,6 +2612,7 @@
         </w:rPr>
         <w:t>dataset</w:t>
       </w:r>
+      <w:proofErr w:type="spellEnd"/>
       <w:r>
         <w:t xml:space="preserve"> </w:t>
       </w:r>
@@ -2500,6 +2939,7 @@
         </w:rPr>
         <w:t xml:space="preserve">Impacto do Learning Rate </w:t>
       </w:r>
+      <w:proofErr w:type="spellStart"/>
       <w:r>
         <w:rPr>
           <w:b/>
@@ -2509,6 +2949,7 @@
         </w:rPr>
         <w:t>Scheduler</w:t>
       </w:r>
+      <w:proofErr w:type="spellEnd"/>
       <w:r>
         <w:rPr>
           <w:b/>
@@ -2590,14 +3031,64 @@
           <w:iCs/>
           <w:color w:val="000000" w:themeColor="text1"/>
         </w:rPr>
-        <w:t xml:space="preserve">Logs do Pycharm estão localizados em </w:t>
-      </w:r>
-      <w:r>
-        <w:rPr>
-          <w:i/>
-          <w:iCs/>
-        </w:rPr>
-        <w:t>"\Projeto-Classificadores\Main_Project\ResNet50\Results\Experimento 5 - ResNet\Experimento 5 - Pycharm LOG.txt"</w:t>
+        <w:t xml:space="preserve">Logs do </w:t>
+      </w:r>
+      <w:proofErr w:type="spellStart"/>
+      <w:r>
+        <w:rPr>
+          <w:i/>
+          <w:iCs/>
+          <w:color w:val="000000" w:themeColor="text1"/>
+        </w:rPr>
+        <w:t>Pycharm</w:t>
+      </w:r>
+      <w:proofErr w:type="spellEnd"/>
+      <w:r>
+        <w:rPr>
+          <w:i/>
+          <w:iCs/>
+          <w:color w:val="000000" w:themeColor="text1"/>
+        </w:rPr>
+        <w:t xml:space="preserve"> estão localizados em </w:t>
+      </w:r>
+      <w:r>
+        <w:rPr>
+          <w:i/>
+          <w:iCs/>
+        </w:rPr>
+        <w:t xml:space="preserve">"\Projeto-Classificadores\Main_Project\ResNet50\Results\Experimento 5 - </w:t>
+      </w:r>
+      <w:proofErr w:type="spellStart"/>
+      <w:r>
+        <w:rPr>
+          <w:i/>
+          <w:iCs/>
+        </w:rPr>
+        <w:t>ResNet</w:t>
+      </w:r>
+      <w:proofErr w:type="spellEnd"/>
+      <w:r>
+        <w:rPr>
+          <w:i/>
+          <w:iCs/>
+        </w:rPr>
+        <w:t xml:space="preserve">\Experimento 5 - </w:t>
+      </w:r>
+      <w:proofErr w:type="spellStart"/>
+      <w:r>
+        <w:rPr>
+          <w:i/>
+          <w:iCs/>
+        </w:rPr>
+        <w:t>Pycharm</w:t>
+      </w:r>
+      <w:proofErr w:type="spellEnd"/>
+      <w:r>
+        <w:rPr>
+          <w:i/>
+          <w:iCs/>
+        </w:rPr>
+        <w:t xml:space="preserve"> LOG.txt"</w:t>
       </w:r>
     </w:p>
     <w:p>
@@ -2664,6 +3155,7 @@
       <w:r>
         <w:t xml:space="preserve">Este experimento busca adequar a profundidade da rede com o tamanho do </w:t>
       </w:r>
+      <w:proofErr w:type="spellStart"/>
       <w:r>
         <w:rPr>
           <w:i/>
@@ -2671,6 +3163,7 @@
         </w:rPr>
         <w:t>Dataset</w:t>
       </w:r>
+      <w:proofErr w:type="spellEnd"/>
       <w:r>
         <w:t xml:space="preserve">. </w:t>
       </w:r>
@@ -2724,23 +3217,59 @@
       <w:r>
         <w:t xml:space="preserve"> ponto crucial é que a ResNet-18 utiliza blocos residuais simples (</w:t>
       </w:r>
-      <w:r>
-        <w:rPr>
-          <w:i/>
-          <w:iCs/>
-        </w:rPr>
-        <w:t>basic blocks</w:t>
-      </w:r>
+      <w:proofErr w:type="spellStart"/>
+      <w:r>
+        <w:rPr>
+          <w:i/>
+          <w:iCs/>
+        </w:rPr>
+        <w:t>basic</w:t>
+      </w:r>
+      <w:proofErr w:type="spellEnd"/>
+      <w:r>
+        <w:rPr>
+          <w:i/>
+          <w:iCs/>
+        </w:rPr>
+        <w:t xml:space="preserve"> </w:t>
+      </w:r>
+      <w:proofErr w:type="spellStart"/>
+      <w:r>
+        <w:rPr>
+          <w:i/>
+          <w:iCs/>
+        </w:rPr>
+        <w:t>blocks</w:t>
+      </w:r>
+      <w:proofErr w:type="spellEnd"/>
       <w:r>
         <w:t xml:space="preserve">) em vez de </w:t>
       </w:r>
-      <w:r>
-        <w:rPr>
-          <w:i/>
-          <w:iCs/>
-        </w:rPr>
-        <w:t>bottleneck blocks</w:t>
-      </w:r>
+      <w:proofErr w:type="spellStart"/>
+      <w:r>
+        <w:rPr>
+          <w:i/>
+          <w:iCs/>
+        </w:rPr>
+        <w:t>bottleneck</w:t>
+      </w:r>
+      <w:proofErr w:type="spellEnd"/>
+      <w:r>
+        <w:rPr>
+          <w:i/>
+          <w:iCs/>
+        </w:rPr>
+        <w:t xml:space="preserve"> </w:t>
+      </w:r>
+      <w:proofErr w:type="spellStart"/>
+      <w:r>
+        <w:rPr>
+          <w:i/>
+          <w:iCs/>
+        </w:rPr>
+        <w:t>blocks</w:t>
+      </w:r>
+      <w:proofErr w:type="spellEnd"/>
       <w:r>
         <w:t>. Esses blocos são estruturalmente mais simples, com menos convoluções por bloco, o que torna o aprendizado mais estável em regimes de poucos dados.</w:t>
       </w:r>
@@ -2789,6 +3318,7 @@
       <w:r>
         <w:t xml:space="preserve"> </w:t>
       </w:r>
+      <w:proofErr w:type="spellStart"/>
       <w:r>
         <w:rPr>
           <w:i/>
@@ -2796,15 +3326,19 @@
         </w:rPr>
         <w:t>loss</w:t>
       </w:r>
+      <w:proofErr w:type="spellEnd"/>
       <w:r>
         <w:t xml:space="preserve"> já aparece como </w:t>
       </w:r>
+      <w:proofErr w:type="spellStart"/>
       <w:r>
         <w:t>NaN</w:t>
       </w:r>
+      <w:proofErr w:type="spellEnd"/>
       <w:r>
         <w:t xml:space="preserve"> no primeiro batch da </w:t>
       </w:r>
+      <w:proofErr w:type="spellStart"/>
       <w:r>
         <w:rPr>
           <w:i/>
@@ -2812,6 +3346,7 @@
         </w:rPr>
         <w:t>Epoch</w:t>
       </w:r>
+      <w:proofErr w:type="spellEnd"/>
       <w:r>
         <w:t xml:space="preserve"> 1, tanto no treino quanto na validação. </w:t>
       </w:r>
@@ -2892,7 +3427,15 @@
         <w:t>Clip de gradiente</w:t>
       </w:r>
       <w:r>
-        <w:t xml:space="preserve"> (ClipNorm)</w:t>
+        <w:t xml:space="preserve"> (</w:t>
+      </w:r>
+      <w:proofErr w:type="spellStart"/>
+      <w:r>
+        <w:t>ClipNorm</w:t>
+      </w:r>
+      <w:proofErr w:type="spellEnd"/>
+      <w:r>
+        <w:t>)</w:t>
       </w:r>
       <w:r>
         <w:t xml:space="preserve"> para blindar contra explosões residuais</w:t>
@@ -2943,6 +3486,7 @@
       <w:r>
         <w:t xml:space="preserve">O parâmetro </w:t>
       </w:r>
+      <w:proofErr w:type="spellStart"/>
       <w:r>
         <w:rPr>
           <w:i/>
@@ -2950,6 +3494,7 @@
         </w:rPr>
         <w:t>clipnorm</w:t>
       </w:r>
+      <w:proofErr w:type="spellEnd"/>
       <w:r>
         <w:t xml:space="preserve"> </w:t>
       </w:r>
@@ -2965,13 +3510,31 @@
       <w:r>
         <w:t xml:space="preserve"> </w:t>
       </w:r>
-      <w:r>
-        <w:rPr>
-          <w:i/>
-          <w:iCs/>
-        </w:rPr>
-        <w:t>exploding gradients</w:t>
-      </w:r>
+      <w:proofErr w:type="spellStart"/>
+      <w:r>
+        <w:rPr>
+          <w:i/>
+          <w:iCs/>
+        </w:rPr>
+        <w:t>exploding</w:t>
+      </w:r>
+      <w:proofErr w:type="spellEnd"/>
+      <w:r>
+        <w:rPr>
+          <w:i/>
+          <w:iCs/>
+        </w:rPr>
+        <w:t xml:space="preserve"> </w:t>
+      </w:r>
+      <w:proofErr w:type="spellStart"/>
+      <w:r>
+        <w:rPr>
+          <w:i/>
+          <w:iCs/>
+        </w:rPr>
+        <w:t>gradients</w:t>
+      </w:r>
+      <w:proofErr w:type="spellEnd"/>
       <w:r>
         <w:t xml:space="preserve">. Durante o treinamento, os gradientes da função de perda em relação aos pesos </w:t>
       </w:r>
@@ -3009,6 +3572,7 @@
       <w:r>
         <w:t xml:space="preserve"> </w:t>
       </w:r>
+      <w:proofErr w:type="spellStart"/>
       <w:r>
         <w:rPr>
           <w:i/>
@@ -3016,6 +3580,7 @@
         </w:rPr>
         <w:t>clipnorm</w:t>
       </w:r>
+      <w:proofErr w:type="spellEnd"/>
       <w:r>
         <w:t xml:space="preserve"> atua limitando a </w:t>
       </w:r>
@@ -3451,7 +4016,15 @@
         <w:jc w:val="both"/>
       </w:pPr>
       <w:r>
-        <w:t>Este experimento busca aprofundar a análise conduzida no Experimento 6, mantendo a mesma variação rasa da arquitetura ResNet (ResNet-18), bem como o mesmo protocolo de treinamento e estratégia de otimização. A principal modificação introduzida consiste no aumento do tamanho do batch, que foi ampliado de 32 para 64 amostras por iteração.</w:t>
+        <w:t xml:space="preserve">Este experimento busca aprofundar a análise conduzida no Experimento 6, mantendo a mesma variação rasa da arquitetura </w:t>
+      </w:r>
+      <w:proofErr w:type="spellStart"/>
+      <w:r>
+        <w:t>ResNet</w:t>
+      </w:r>
+      <w:proofErr w:type="spellEnd"/>
+      <w:r>
+        <w:t xml:space="preserve"> (ResNet-18), bem como o mesmo protocolo de treinamento e estratégia de otimização. A principal modificação introduzida consiste no aumento do tamanho do batch, que foi ampliado de 32 para 64 amostras por iteração.</w:t>
       </w:r>
     </w:p>
     <w:p>
@@ -3729,6 +4302,7 @@
       <w:r>
         <w:t xml:space="preserve">da família </w:t>
       </w:r>
+      <w:proofErr w:type="spellStart"/>
       <w:r>
         <w:rPr>
           <w:i/>
@@ -3736,6 +4310,7 @@
         </w:rPr>
         <w:t>ResNet</w:t>
       </w:r>
+      <w:proofErr w:type="spellEnd"/>
       <w:r>
         <w:t xml:space="preserve">, </w:t>
       </w:r>
@@ -3748,6 +4323,7 @@
       <w:r>
         <w:t xml:space="preserve">utiliza o chamado </w:t>
       </w:r>
+      <w:proofErr w:type="spellStart"/>
       <w:r>
         <w:rPr>
           <w:i/>
@@ -3755,9 +4331,11 @@
         </w:rPr>
         <w:t>BasicBlock</w:t>
       </w:r>
+      <w:proofErr w:type="spellEnd"/>
       <w:r>
         <w:t xml:space="preserve">, que é composto por dois blocos convolucionais 3×3 consecutivos, cada um seguido por Batch </w:t>
       </w:r>
+      <w:proofErr w:type="spellStart"/>
       <w:r>
         <w:rPr>
           <w:i/>
@@ -3765,9 +4343,11 @@
         </w:rPr>
         <w:t>Normalization</w:t>
       </w:r>
+      <w:proofErr w:type="spellEnd"/>
       <w:r>
         <w:t xml:space="preserve"> e </w:t>
       </w:r>
+      <w:proofErr w:type="spellStart"/>
       <w:r>
         <w:rPr>
           <w:i/>
@@ -3775,6 +4355,7 @@
         </w:rPr>
         <w:t>ReLU</w:t>
       </w:r>
+      <w:proofErr w:type="spellEnd"/>
       <w:r>
         <w:t>.</w:t>
       </w:r>
@@ -3975,7 +4556,15 @@
         <w:t>.</w:t>
       </w:r>
       <w:r>
-        <w:t xml:space="preserve"> A ideia deste experimento é igualar o batch_size para garantir qual apresenta melhor desempenho sob as mesmas condições de treino.</w:t>
+        <w:t xml:space="preserve"> A ideia deste experimento é igualar o </w:t>
+      </w:r>
+      <w:proofErr w:type="spellStart"/>
+      <w:r>
+        <w:t>batch_size</w:t>
+      </w:r>
+      <w:proofErr w:type="spellEnd"/>
+      <w:r>
+        <w:t xml:space="preserve"> para garantir qual apresenta melhor desempenho sob as mesmas condições de treino.</w:t>
       </w:r>
     </w:p>
     <w:p>
@@ -4256,14 +4845,64 @@
           <w:iCs/>
           <w:color w:val="000000" w:themeColor="text1"/>
         </w:rPr>
-        <w:t xml:space="preserve">Logs do Pycharm estão localizados em </w:t>
-      </w:r>
-      <w:r>
-        <w:rPr>
-          <w:i/>
-          <w:iCs/>
-        </w:rPr>
-        <w:t>"\Projeto-Classificadores\Main_Project\ResNet\Results\Experimento 11 - ResNet\Experimento 11- Pycharm LOG.txt"</w:t>
+        <w:t xml:space="preserve">Logs do </w:t>
+      </w:r>
+      <w:proofErr w:type="spellStart"/>
+      <w:r>
+        <w:rPr>
+          <w:i/>
+          <w:iCs/>
+          <w:color w:val="000000" w:themeColor="text1"/>
+        </w:rPr>
+        <w:t>Pycharm</w:t>
+      </w:r>
+      <w:proofErr w:type="spellEnd"/>
+      <w:r>
+        <w:rPr>
+          <w:i/>
+          <w:iCs/>
+          <w:color w:val="000000" w:themeColor="text1"/>
+        </w:rPr>
+        <w:t xml:space="preserve"> estão localizados em </w:t>
+      </w:r>
+      <w:r>
+        <w:rPr>
+          <w:i/>
+          <w:iCs/>
+        </w:rPr>
+        <w:t xml:space="preserve">"\Projeto-Classificadores\Main_Project\ResNet\Results\Experimento 11 - </w:t>
+      </w:r>
+      <w:proofErr w:type="spellStart"/>
+      <w:r>
+        <w:rPr>
+          <w:i/>
+          <w:iCs/>
+        </w:rPr>
+        <w:t>ResNet</w:t>
+      </w:r>
+      <w:proofErr w:type="spellEnd"/>
+      <w:r>
+        <w:rPr>
+          <w:i/>
+          <w:iCs/>
+        </w:rPr>
+        <w:t xml:space="preserve">\Experimento 11- </w:t>
+      </w:r>
+      <w:proofErr w:type="spellStart"/>
+      <w:r>
+        <w:rPr>
+          <w:i/>
+          <w:iCs/>
+        </w:rPr>
+        <w:t>Pycharm</w:t>
+      </w:r>
+      <w:proofErr w:type="spellEnd"/>
+      <w:r>
+        <w:rPr>
+          <w:i/>
+          <w:iCs/>
+        </w:rPr>
+        <w:t xml:space="preserve"> LOG.txt"</w:t>
       </w:r>
     </w:p>
     <w:p>
@@ -4494,14 +5133,64 @@
           <w:iCs/>
           <w:color w:val="000000" w:themeColor="text1"/>
         </w:rPr>
-        <w:t xml:space="preserve">Logs do Pycharm estão localizados em </w:t>
-      </w:r>
-      <w:r>
-        <w:rPr>
-          <w:i/>
-          <w:iCs/>
-        </w:rPr>
-        <w:t>"\Projeto-Classificadores\Main_Project\ResNet\Results\Experimento 12 - ResNet\Experimento 12- Pycharm LOG.txt"</w:t>
+        <w:t xml:space="preserve">Logs do </w:t>
+      </w:r>
+      <w:proofErr w:type="spellStart"/>
+      <w:r>
+        <w:rPr>
+          <w:i/>
+          <w:iCs/>
+          <w:color w:val="000000" w:themeColor="text1"/>
+        </w:rPr>
+        <w:t>Pycharm</w:t>
+      </w:r>
+      <w:proofErr w:type="spellEnd"/>
+      <w:r>
+        <w:rPr>
+          <w:i/>
+          <w:iCs/>
+          <w:color w:val="000000" w:themeColor="text1"/>
+        </w:rPr>
+        <w:t xml:space="preserve"> estão localizados em </w:t>
+      </w:r>
+      <w:r>
+        <w:rPr>
+          <w:i/>
+          <w:iCs/>
+        </w:rPr>
+        <w:t xml:space="preserve">"\Projeto-Classificadores\Main_Project\ResNet\Results\Experimento 12 - </w:t>
+      </w:r>
+      <w:proofErr w:type="spellStart"/>
+      <w:r>
+        <w:rPr>
+          <w:i/>
+          <w:iCs/>
+        </w:rPr>
+        <w:t>ResNet</w:t>
+      </w:r>
+      <w:proofErr w:type="spellEnd"/>
+      <w:r>
+        <w:rPr>
+          <w:i/>
+          <w:iCs/>
+        </w:rPr>
+        <w:t xml:space="preserve">\Experimento 12- </w:t>
+      </w:r>
+      <w:proofErr w:type="spellStart"/>
+      <w:r>
+        <w:rPr>
+          <w:i/>
+          <w:iCs/>
+        </w:rPr>
+        <w:t>Pycharm</w:t>
+      </w:r>
+      <w:proofErr w:type="spellEnd"/>
+      <w:r>
+        <w:rPr>
+          <w:i/>
+          <w:iCs/>
+        </w:rPr>
+        <w:t xml:space="preserve"> LOG.txt"</w:t>
       </w:r>
     </w:p>
     <w:p>
@@ -4631,7 +5320,15 @@
         <w:t xml:space="preserve">deste experimento é </w:t>
       </w:r>
       <w:r>
-        <w:t>tentar alcançar um platô nos resultados, utilizando a configuração que obteve a maior eficiência dentre os experimentos anteriores (Variante 18 com Batch Size = 32)</w:t>
+        <w:t xml:space="preserve">tentar alcançar um platô nos resultados, utilizando a configuração que obteve a maior eficiência dentre os experimentos anteriores (Variante 18 com Batch </w:t>
+      </w:r>
+      <w:proofErr w:type="spellStart"/>
+      <w:r>
+        <w:t>Size</w:t>
+      </w:r>
+      <w:proofErr w:type="spellEnd"/>
+      <w:r>
+        <w:t xml:space="preserve"> = 32)</w:t>
       </w:r>
     </w:p>
     <w:p>
@@ -4784,14 +5481,64 @@
           <w:iCs/>
           <w:color w:val="000000" w:themeColor="text1"/>
         </w:rPr>
-        <w:t xml:space="preserve">Logs do Pycharm estão localizados em </w:t>
-      </w:r>
-      <w:r>
-        <w:rPr>
-          <w:i/>
-          <w:iCs/>
-        </w:rPr>
-        <w:t>"\Projeto-Classificadores\Main_Project\ResNet\Results\Experimento 13 - ResNet\Experimento 13- Pycharm LOG.txt"</w:t>
+        <w:t xml:space="preserve">Logs do </w:t>
+      </w:r>
+      <w:proofErr w:type="spellStart"/>
+      <w:r>
+        <w:rPr>
+          <w:i/>
+          <w:iCs/>
+          <w:color w:val="000000" w:themeColor="text1"/>
+        </w:rPr>
+        <w:t>Pycharm</w:t>
+      </w:r>
+      <w:proofErr w:type="spellEnd"/>
+      <w:r>
+        <w:rPr>
+          <w:i/>
+          <w:iCs/>
+          <w:color w:val="000000" w:themeColor="text1"/>
+        </w:rPr>
+        <w:t xml:space="preserve"> estão localizados em </w:t>
+      </w:r>
+      <w:r>
+        <w:rPr>
+          <w:i/>
+          <w:iCs/>
+        </w:rPr>
+        <w:t xml:space="preserve">"\Projeto-Classificadores\Main_Project\ResNet\Results\Experimento 13 - </w:t>
+      </w:r>
+      <w:proofErr w:type="spellStart"/>
+      <w:r>
+        <w:rPr>
+          <w:i/>
+          <w:iCs/>
+        </w:rPr>
+        <w:t>ResNet</w:t>
+      </w:r>
+      <w:proofErr w:type="spellEnd"/>
+      <w:r>
+        <w:rPr>
+          <w:i/>
+          <w:iCs/>
+        </w:rPr>
+        <w:t xml:space="preserve">\Experimento 13- </w:t>
+      </w:r>
+      <w:proofErr w:type="spellStart"/>
+      <w:r>
+        <w:rPr>
+          <w:i/>
+          <w:iCs/>
+        </w:rPr>
+        <w:t>Pycharm</w:t>
+      </w:r>
+      <w:proofErr w:type="spellEnd"/>
+      <w:r>
+        <w:rPr>
+          <w:i/>
+          <w:iCs/>
+        </w:rPr>
+        <w:t xml:space="preserve"> LOG.txt"</w:t>
       </w:r>
     </w:p>
     <w:p>
@@ -4839,7 +5586,7 @@
           <w:b/>
           <w:bCs/>
         </w:rPr>
-        <w:t>TESTE DE 3000 ÉPOCAS COM RESNET-18 E BS = 32 (FINAL)</w:t>
+        <w:t xml:space="preserve">TESTE DE 3000 ÉPOCAS COM RESNET-18 E BS = 32 </w:t>
       </w:r>
     </w:p>
     <w:p>
@@ -4854,7 +5601,15 @@
         <w:t xml:space="preserve">deste experimento é </w:t>
       </w:r>
       <w:r>
-        <w:t>repetir o experimento 13 ampliando consideravelmente a quantidade de épocas, tentando novamente alcançar um platô nos resultados, utilizando a configuração que obteve a maior eficiência dentre os experimentos anteriores (Variante 18 com Batch Size = 32)</w:t>
+        <w:t xml:space="preserve">repetir o experimento 13 ampliando consideravelmente a quantidade de épocas, tentando novamente alcançar um platô nos resultados, utilizando a configuração que obteve a maior eficiência dentre os experimentos anteriores (Variante 18 com Batch </w:t>
+      </w:r>
+      <w:proofErr w:type="spellStart"/>
+      <w:r>
+        <w:t>Size</w:t>
+      </w:r>
+      <w:proofErr w:type="spellEnd"/>
+      <w:r>
+        <w:t xml:space="preserve"> = 32)</w:t>
       </w:r>
     </w:p>
     <w:p>
@@ -5011,14 +5766,64 @@
           <w:iCs/>
           <w:color w:val="000000" w:themeColor="text1"/>
         </w:rPr>
-        <w:t xml:space="preserve">Logs do Pycharm estão localizados em </w:t>
-      </w:r>
-      <w:r>
-        <w:rPr>
-          <w:i/>
-          <w:iCs/>
-        </w:rPr>
-        <w:t>"\Projeto-Classificadores\Main_Project\ResNet\Results\Experimento 14 - ResNet\Experimento 14- Pycharm LOG.txt"</w:t>
+        <w:t xml:space="preserve">Logs do </w:t>
+      </w:r>
+      <w:proofErr w:type="spellStart"/>
+      <w:r>
+        <w:rPr>
+          <w:i/>
+          <w:iCs/>
+          <w:color w:val="000000" w:themeColor="text1"/>
+        </w:rPr>
+        <w:t>Pycharm</w:t>
+      </w:r>
+      <w:proofErr w:type="spellEnd"/>
+      <w:r>
+        <w:rPr>
+          <w:i/>
+          <w:iCs/>
+          <w:color w:val="000000" w:themeColor="text1"/>
+        </w:rPr>
+        <w:t xml:space="preserve"> estão localizados em </w:t>
+      </w:r>
+      <w:r>
+        <w:rPr>
+          <w:i/>
+          <w:iCs/>
+        </w:rPr>
+        <w:t xml:space="preserve">"\Projeto-Classificadores\Main_Project\ResNet\Results\Experimento 14 - </w:t>
+      </w:r>
+      <w:proofErr w:type="spellStart"/>
+      <w:r>
+        <w:rPr>
+          <w:i/>
+          <w:iCs/>
+        </w:rPr>
+        <w:t>ResNet</w:t>
+      </w:r>
+      <w:proofErr w:type="spellEnd"/>
+      <w:r>
+        <w:rPr>
+          <w:i/>
+          <w:iCs/>
+        </w:rPr>
+        <w:t xml:space="preserve">\Experimento 14- </w:t>
+      </w:r>
+      <w:proofErr w:type="spellStart"/>
+      <w:r>
+        <w:rPr>
+          <w:i/>
+          <w:iCs/>
+        </w:rPr>
+        <w:t>Pycharm</w:t>
+      </w:r>
+      <w:proofErr w:type="spellEnd"/>
+      <w:r>
+        <w:rPr>
+          <w:i/>
+          <w:iCs/>
+        </w:rPr>
+        <w:t xml:space="preserve"> LOG.txt"</w:t>
       </w:r>
     </w:p>
     <w:p>
@@ -5048,7 +5853,507 @@
         <w:lastRenderedPageBreak/>
         <w:t xml:space="preserve">EXPERIMENTO 15 (RESNET) – TESTE DE 500 ÉPOCAS COM RESNET34 E BS = 32 </w:t>
       </w:r>
-    </w:p>
+      <w:r>
+        <w:rPr>
+          <w:b/>
+          <w:bCs/>
+        </w:rPr>
+        <w:t>;</w:t>
+      </w:r>
+    </w:p>
+    <w:p>
+      <w:pPr>
+        <w:pStyle w:val="PargrafodaLista"/>
+        <w:jc w:val="both"/>
+        <w:rPr>
+          <w:b/>
+          <w:bCs/>
+        </w:rPr>
+      </w:pPr>
+      <w:r>
+        <w:rPr>
+          <w:b/>
+          <w:bCs/>
+        </w:rPr>
+        <w:t>EXPERIMENTO 16 (RESNET) – TESTE DE 500 ÉPOCAS COM RESNET50 E BS = 32</w:t>
+      </w:r>
+      <w:r>
+        <w:rPr>
+          <w:b/>
+          <w:bCs/>
+        </w:rPr>
+        <w:t>;</w:t>
+      </w:r>
+    </w:p>
+    <w:p>
+      <w:pPr>
+        <w:pStyle w:val="PargrafodaLista"/>
+        <w:jc w:val="both"/>
+        <w:rPr>
+          <w:b/>
+          <w:bCs/>
+        </w:rPr>
+      </w:pPr>
+      <w:r>
+        <w:rPr>
+          <w:b/>
+          <w:bCs/>
+        </w:rPr>
+        <w:t>EXPERIMENTO 17 (RESNET) – TESTE DE 500 ÉPOCAS COM RESNET10 E BS = 32</w:t>
+      </w:r>
+      <w:r>
+        <w:rPr>
+          <w:b/>
+          <w:bCs/>
+        </w:rPr>
+        <w:t>;</w:t>
+      </w:r>
+    </w:p>
+    <w:p>
+      <w:pPr>
+        <w:pStyle w:val="PargrafodaLista"/>
+        <w:jc w:val="both"/>
+        <w:rPr>
+          <w:b/>
+          <w:bCs/>
+        </w:rPr>
+      </w:pPr>
+    </w:p>
+    <w:p>
+      <w:pPr>
+        <w:pStyle w:val="PargrafodaLista"/>
+        <w:jc w:val="both"/>
+      </w:pPr>
+      <w:r>
+        <w:t xml:space="preserve">O objetivo </w:t>
+      </w:r>
+      <w:r>
+        <w:t>de</w:t>
+      </w:r>
+      <w:r>
+        <w:t>stes 3 experimentos</w:t>
+      </w:r>
+      <w:r>
+        <w:t xml:space="preserve"> </w:t>
+      </w:r>
+      <w:r>
+        <w:t>foi</w:t>
+      </w:r>
+      <w:r>
+        <w:t xml:space="preserve"> </w:t>
+      </w:r>
+      <w:r>
+        <w:t xml:space="preserve">conduzir um novo treinamento com as variantes 34, 50 e 10, seguindo estritamente os mesmos parâmetros utilizados para o experimento conduzido com a variante 18 (Que apresentou os resultados mais promissores). A ideia é viabilizar um comparativo justo entre os modelos baseados na </w:t>
+      </w:r>
+      <w:proofErr w:type="spellStart"/>
+      <w:r>
+        <w:t>ResNet</w:t>
+      </w:r>
+      <w:proofErr w:type="spellEnd"/>
+      <w:r>
+        <w:t>.</w:t>
+      </w:r>
+    </w:p>
+    <w:p>
+      <w:pPr>
+        <w:pStyle w:val="PargrafodaLista"/>
+        <w:jc w:val="both"/>
+        <w:rPr>
+          <w:b/>
+          <w:bCs/>
+        </w:rPr>
+      </w:pPr>
+    </w:p>
+    <w:p>
+      <w:pPr>
+        <w:pStyle w:val="PargrafodaLista"/>
+        <w:numPr>
+          <w:ilvl w:val="0"/>
+          <w:numId w:val="43"/>
+        </w:numPr>
+      </w:pPr>
+      <w:r>
+        <w:rPr>
+          <w:b/>
+          <w:bCs/>
+        </w:rPr>
+        <w:t xml:space="preserve">Resultados obtidos: </w:t>
+      </w:r>
+      <w:r>
+        <w:rPr>
+          <w:i/>
+          <w:iCs/>
+        </w:rPr>
+        <w:t>Os</w:t>
+      </w:r>
+      <w:r>
+        <w:rPr>
+          <w:b/>
+          <w:bCs/>
+          <w:i/>
+          <w:iCs/>
+        </w:rPr>
+        <w:t xml:space="preserve"> </w:t>
+      </w:r>
+      <w:r>
+        <w:rPr>
+          <w:i/>
+          <w:iCs/>
+          <w:color w:val="000000" w:themeColor="text1"/>
+        </w:rPr>
+        <w:t xml:space="preserve">Logs do </w:t>
+      </w:r>
+      <w:proofErr w:type="spellStart"/>
+      <w:r>
+        <w:rPr>
+          <w:i/>
+          <w:iCs/>
+          <w:color w:val="000000" w:themeColor="text1"/>
+        </w:rPr>
+        <w:t>Pycharm</w:t>
+      </w:r>
+      <w:proofErr w:type="spellEnd"/>
+      <w:r>
+        <w:rPr>
+          <w:i/>
+          <w:iCs/>
+          <w:color w:val="000000" w:themeColor="text1"/>
+        </w:rPr>
+        <w:t xml:space="preserve"> </w:t>
+      </w:r>
+      <w:r>
+        <w:rPr>
+          <w:color w:val="000000" w:themeColor="text1"/>
+        </w:rPr>
+        <w:t>e as curvas de acurácia/perda</w:t>
+      </w:r>
+      <w:r>
+        <w:rPr>
+          <w:i/>
+          <w:iCs/>
+          <w:color w:val="000000" w:themeColor="text1"/>
+        </w:rPr>
+        <w:t xml:space="preserve"> estão localizados em </w:t>
+      </w:r>
+      <w:r>
+        <w:rPr>
+          <w:i/>
+          <w:iCs/>
+        </w:rPr>
+        <w:t>"\Projeto-Classificadores\Main_Project\ResNet\Results\Experimento 1</w:t>
+      </w:r>
+      <w:r>
+        <w:rPr>
+          <w:i/>
+          <w:iCs/>
+        </w:rPr>
+        <w:t>5</w:t>
+      </w:r>
+      <w:r>
+        <w:rPr>
+          <w:i/>
+          <w:iCs/>
+        </w:rPr>
+        <w:t xml:space="preserve"> - </w:t>
+      </w:r>
+      <w:proofErr w:type="spellStart"/>
+      <w:r>
+        <w:rPr>
+          <w:i/>
+          <w:iCs/>
+        </w:rPr>
+        <w:t>ResNet</w:t>
+      </w:r>
+      <w:proofErr w:type="spellEnd"/>
+      <w:r>
+        <w:rPr>
+          <w:i/>
+          <w:iCs/>
+        </w:rPr>
+        <w:t>\</w:t>
+      </w:r>
+      <w:r>
+        <w:rPr>
+          <w:i/>
+          <w:iCs/>
+        </w:rPr>
+        <w:t>training metrics.xlsx</w:t>
+      </w:r>
+      <w:r>
+        <w:rPr>
+          <w:i/>
+          <w:iCs/>
+        </w:rPr>
+        <w:t>"</w:t>
+      </w:r>
+    </w:p>
+    <w:p>
+      <w:pPr>
+        <w:pStyle w:val="PargrafodaLista"/>
+        <w:jc w:val="both"/>
+        <w:rPr>
+          <w:b/>
+          <w:bCs/>
+        </w:rPr>
+      </w:pPr>
+    </w:p>
+    <w:p>
+      <w:pPr>
+        <w:pStyle w:val="PargrafodaLista"/>
+        <w:numPr>
+          <w:ilvl w:val="0"/>
+          <w:numId w:val="43"/>
+        </w:numPr>
+      </w:pPr>
+      <w:r>
+        <w:rPr>
+          <w:b/>
+          <w:bCs/>
+        </w:rPr>
+        <w:t xml:space="preserve">Resultados obtidos: </w:t>
+      </w:r>
+      <w:r>
+        <w:rPr>
+          <w:i/>
+          <w:iCs/>
+        </w:rPr>
+        <w:t>Os</w:t>
+      </w:r>
+      <w:r>
+        <w:rPr>
+          <w:b/>
+          <w:bCs/>
+          <w:i/>
+          <w:iCs/>
+        </w:rPr>
+        <w:t xml:space="preserve"> </w:t>
+      </w:r>
+      <w:r>
+        <w:rPr>
+          <w:i/>
+          <w:iCs/>
+          <w:color w:val="000000" w:themeColor="text1"/>
+        </w:rPr>
+        <w:t xml:space="preserve">Logs do </w:t>
+      </w:r>
+      <w:proofErr w:type="spellStart"/>
+      <w:r>
+        <w:rPr>
+          <w:i/>
+          <w:iCs/>
+          <w:color w:val="000000" w:themeColor="text1"/>
+        </w:rPr>
+        <w:t>Pycharm</w:t>
+      </w:r>
+      <w:proofErr w:type="spellEnd"/>
+      <w:r>
+        <w:rPr>
+          <w:i/>
+          <w:iCs/>
+          <w:color w:val="000000" w:themeColor="text1"/>
+        </w:rPr>
+        <w:t xml:space="preserve"> </w:t>
+      </w:r>
+      <w:r>
+        <w:rPr>
+          <w:color w:val="000000" w:themeColor="text1"/>
+        </w:rPr>
+        <w:t>e as curvas de acurácia/perda</w:t>
+      </w:r>
+      <w:r>
+        <w:rPr>
+          <w:i/>
+          <w:iCs/>
+          <w:color w:val="000000" w:themeColor="text1"/>
+        </w:rPr>
+        <w:t xml:space="preserve"> estão localizados em </w:t>
+      </w:r>
+      <w:r>
+        <w:rPr>
+          <w:i/>
+          <w:iCs/>
+        </w:rPr>
+        <w:t>"\Projeto-Classificadores\Main_Project\ResNet\Results\Experimento 1</w:t>
+      </w:r>
+      <w:r>
+        <w:rPr>
+          <w:i/>
+          <w:iCs/>
+        </w:rPr>
+        <w:t>6</w:t>
+      </w:r>
+      <w:r>
+        <w:rPr>
+          <w:i/>
+          <w:iCs/>
+        </w:rPr>
+        <w:t xml:space="preserve"> - </w:t>
+      </w:r>
+      <w:proofErr w:type="spellStart"/>
+      <w:r>
+        <w:rPr>
+          <w:i/>
+          <w:iCs/>
+        </w:rPr>
+        <w:t>ResNet</w:t>
+      </w:r>
+      <w:proofErr w:type="spellEnd"/>
+      <w:r>
+        <w:rPr>
+          <w:i/>
+          <w:iCs/>
+        </w:rPr>
+        <w:t>\</w:t>
+      </w:r>
+      <w:r>
+        <w:rPr>
+          <w:i/>
+          <w:iCs/>
+        </w:rPr>
+        <w:t>training metrics.xlsx</w:t>
+      </w:r>
+      <w:r>
+        <w:rPr>
+          <w:i/>
+          <w:iCs/>
+        </w:rPr>
+        <w:t>"</w:t>
+      </w:r>
+    </w:p>
+    <w:p>
+      <w:pPr>
+        <w:pStyle w:val="PargrafodaLista"/>
+        <w:jc w:val="both"/>
+        <w:rPr>
+          <w:b/>
+          <w:bCs/>
+        </w:rPr>
+      </w:pPr>
+    </w:p>
+    <w:p>
+      <w:pPr>
+        <w:pStyle w:val="PargrafodaLista"/>
+        <w:numPr>
+          <w:ilvl w:val="0"/>
+          <w:numId w:val="43"/>
+        </w:numPr>
+      </w:pPr>
+      <w:r>
+        <w:rPr>
+          <w:b/>
+          <w:bCs/>
+        </w:rPr>
+        <w:t xml:space="preserve">Resultados obtidos: </w:t>
+      </w:r>
+      <w:r>
+        <w:rPr>
+          <w:i/>
+          <w:iCs/>
+        </w:rPr>
+        <w:t>Os</w:t>
+      </w:r>
+      <w:r>
+        <w:rPr>
+          <w:b/>
+          <w:bCs/>
+          <w:i/>
+          <w:iCs/>
+        </w:rPr>
+        <w:t xml:space="preserve"> </w:t>
+      </w:r>
+      <w:r>
+        <w:rPr>
+          <w:i/>
+          <w:iCs/>
+          <w:color w:val="000000" w:themeColor="text1"/>
+        </w:rPr>
+        <w:t xml:space="preserve">Logs do </w:t>
+      </w:r>
+      <w:proofErr w:type="spellStart"/>
+      <w:r>
+        <w:rPr>
+          <w:i/>
+          <w:iCs/>
+          <w:color w:val="000000" w:themeColor="text1"/>
+        </w:rPr>
+        <w:t>Pycharm</w:t>
+      </w:r>
+      <w:proofErr w:type="spellEnd"/>
+      <w:r>
+        <w:rPr>
+          <w:i/>
+          <w:iCs/>
+          <w:color w:val="000000" w:themeColor="text1"/>
+        </w:rPr>
+        <w:t xml:space="preserve"> </w:t>
+      </w:r>
+      <w:r>
+        <w:rPr>
+          <w:color w:val="000000" w:themeColor="text1"/>
+        </w:rPr>
+        <w:t>e as curvas de acurácia/perda</w:t>
+      </w:r>
+      <w:r>
+        <w:rPr>
+          <w:i/>
+          <w:iCs/>
+          <w:color w:val="000000" w:themeColor="text1"/>
+        </w:rPr>
+        <w:t xml:space="preserve"> estão localizados em </w:t>
+      </w:r>
+      <w:r>
+        <w:rPr>
+          <w:i/>
+          <w:iCs/>
+        </w:rPr>
+        <w:t>"\Projeto-Classificadores\Main_Project\ResNet\Results\Experimento 1</w:t>
+      </w:r>
+      <w:r>
+        <w:rPr>
+          <w:i/>
+          <w:iCs/>
+        </w:rPr>
+        <w:t>7</w:t>
+      </w:r>
+      <w:r>
+        <w:rPr>
+          <w:i/>
+          <w:iCs/>
+        </w:rPr>
+        <w:t xml:space="preserve"> - </w:t>
+      </w:r>
+      <w:proofErr w:type="spellStart"/>
+      <w:r>
+        <w:rPr>
+          <w:i/>
+          <w:iCs/>
+        </w:rPr>
+        <w:t>ResNet</w:t>
+      </w:r>
+      <w:proofErr w:type="spellEnd"/>
+      <w:r>
+        <w:rPr>
+          <w:i/>
+          <w:iCs/>
+        </w:rPr>
+        <w:t>\</w:t>
+      </w:r>
+      <w:r>
+        <w:rPr>
+          <w:i/>
+          <w:iCs/>
+        </w:rPr>
+        <w:t>training metrics.xlsx</w:t>
+      </w:r>
+      <w:r>
+        <w:rPr>
+          <w:i/>
+          <w:iCs/>
+        </w:rPr>
+        <w:t>"</w:t>
+      </w:r>
+    </w:p>
+    <w:p/>
     <w:p>
       <w:pPr>
         <w:pStyle w:val="PargrafodaLista"/>
@@ -5067,100 +6372,193 @@
           <w:b/>
           <w:bCs/>
         </w:rPr>
-        <w:t>EXPERIMENTO 16 (RESNET) – TESTE DE 500 ÉPOCAS COM RESNET50 E BS = 32</w:t>
-      </w:r>
+        <w:t>EXPERIMENTO 18 (RESNET) – TESTE DE 3000 ÉPOCAS COM RESNET34 E BS = 32</w:t>
+      </w:r>
+    </w:p>
+    <w:p>
+      <w:pPr>
+        <w:pStyle w:val="PargrafodaLista"/>
+        <w:jc w:val="both"/>
+        <w:rPr>
+          <w:b/>
+          <w:bCs/>
+        </w:rPr>
+      </w:pPr>
+    </w:p>
+    <w:p>
+      <w:pPr>
+        <w:pStyle w:val="PargrafodaLista"/>
+        <w:jc w:val="both"/>
+      </w:pPr>
+      <w:r>
+        <w:t xml:space="preserve">O objetivo </w:t>
+      </w:r>
+      <w:r>
+        <w:t>de</w:t>
+      </w:r>
+      <w:r>
+        <w:t>ste experimento</w:t>
+      </w:r>
+      <w:r>
+        <w:t xml:space="preserve"> </w:t>
+      </w:r>
+      <w:r>
+        <w:t>foi</w:t>
+      </w:r>
+      <w:r>
+        <w:t xml:space="preserve"> </w:t>
+      </w:r>
+      <w:r>
+        <w:t xml:space="preserve">conduzir um treinamento </w:t>
+      </w:r>
+      <w:r>
+        <w:t>estendido da variante 34</w:t>
+      </w:r>
+      <w:r>
+        <w:t xml:space="preserve">, </w:t>
+      </w:r>
+      <w:r>
+        <w:t>uma vez que ela apresentou resultados promissores, próximos ao que foi apresentado pela ResNet-18. A ideia, portanto, é comparar as variantes mais promissoras no contexto geral.</w:t>
+      </w:r>
+    </w:p>
+    <w:p>
+      <w:pPr>
+        <w:pStyle w:val="PargrafodaLista"/>
+        <w:jc w:val="both"/>
+      </w:pPr>
     </w:p>
     <w:p>
       <w:pPr>
         <w:pStyle w:val="PargrafodaLista"/>
         <w:numPr>
           <w:ilvl w:val="0"/>
-          <w:numId w:val="1"/>
+          <w:numId w:val="43"/>
         </w:numPr>
-        <w:jc w:val="both"/>
-        <w:rPr>
-          <w:b/>
-          <w:bCs/>
-        </w:rPr>
-      </w:pPr>
-      <w:r>
-        <w:rPr>
-          <w:b/>
-          <w:bCs/>
-        </w:rPr>
-        <w:t>EXPERIMENTO 17 (RESNET) – TESTE DE 500 ÉPOCAS COM RESNET10 E BS = 32</w:t>
-      </w:r>
-    </w:p>
-    <w:p>
-      <w:pPr>
-        <w:pStyle w:val="PargrafodaLista"/>
-        <w:numPr>
-          <w:ilvl w:val="0"/>
-          <w:numId w:val="1"/>
-        </w:numPr>
-        <w:jc w:val="both"/>
-        <w:rPr>
-          <w:b/>
-          <w:bCs/>
-        </w:rPr>
-      </w:pPr>
-      <w:r>
-        <w:rPr>
-          <w:b/>
-          <w:bCs/>
-        </w:rPr>
-        <w:t>EXPERIMENTO 1</w:t>
-      </w:r>
-      <w:r>
-        <w:rPr>
-          <w:b/>
-          <w:bCs/>
+      </w:pPr>
+      <w:r>
+        <w:rPr>
+          <w:b/>
+          <w:bCs/>
+        </w:rPr>
+        <w:t xml:space="preserve">Resultados obtidos: </w:t>
+      </w:r>
+      <w:r>
+        <w:rPr>
+          <w:i/>
+          <w:iCs/>
+        </w:rPr>
+        <w:t>Os</w:t>
+      </w:r>
+      <w:r>
+        <w:rPr>
+          <w:b/>
+          <w:bCs/>
+          <w:i/>
+          <w:iCs/>
+        </w:rPr>
+        <w:t xml:space="preserve"> </w:t>
+      </w:r>
+      <w:r>
+        <w:rPr>
+          <w:i/>
+          <w:iCs/>
+          <w:color w:val="000000" w:themeColor="text1"/>
+        </w:rPr>
+        <w:t xml:space="preserve">Logs do </w:t>
+      </w:r>
+      <w:proofErr w:type="spellStart"/>
+      <w:r>
+        <w:rPr>
+          <w:i/>
+          <w:iCs/>
+          <w:color w:val="000000" w:themeColor="text1"/>
+        </w:rPr>
+        <w:t>Pycharm</w:t>
+      </w:r>
+      <w:proofErr w:type="spellEnd"/>
+      <w:r>
+        <w:rPr>
+          <w:i/>
+          <w:iCs/>
+          <w:color w:val="000000" w:themeColor="text1"/>
+        </w:rPr>
+        <w:t xml:space="preserve"> </w:t>
+      </w:r>
+      <w:r>
+        <w:rPr>
+          <w:color w:val="000000" w:themeColor="text1"/>
+        </w:rPr>
+        <w:t>e as curvas de acurácia/perda</w:t>
+      </w:r>
+      <w:r>
+        <w:rPr>
+          <w:i/>
+          <w:iCs/>
+          <w:color w:val="000000" w:themeColor="text1"/>
+        </w:rPr>
+        <w:t xml:space="preserve"> estão localizados em </w:t>
+      </w:r>
+      <w:r>
+        <w:rPr>
+          <w:i/>
+          <w:iCs/>
+        </w:rPr>
+        <w:t>"\Projeto-Classificadores\Main_Project\ResNet\Results\Experimento 1</w:t>
+      </w:r>
+      <w:r>
+        <w:rPr>
+          <w:i/>
+          <w:iCs/>
         </w:rPr>
         <w:t>8</w:t>
       </w:r>
       <w:r>
         <w:rPr>
-          <w:b/>
-          <w:bCs/>
-        </w:rPr>
-        <w:t xml:space="preserve"> (RESNET) – TESTE DE </w:t>
-      </w:r>
-      <w:r>
-        <w:rPr>
-          <w:b/>
-          <w:bCs/>
-        </w:rPr>
-        <w:t>3000</w:t>
-      </w:r>
-      <w:r>
-        <w:rPr>
-          <w:b/>
-          <w:bCs/>
-        </w:rPr>
-        <w:t xml:space="preserve"> ÉPOCAS COM RESNET</w:t>
-      </w:r>
-      <w:r>
-        <w:rPr>
-          <w:b/>
-          <w:bCs/>
-        </w:rPr>
-        <w:t>34</w:t>
-      </w:r>
-      <w:r>
-        <w:rPr>
-          <w:b/>
-          <w:bCs/>
-        </w:rPr>
-        <w:t xml:space="preserve"> E BS = 32</w:t>
-      </w:r>
-    </w:p>
-    <w:p>
-      <w:pPr>
-        <w:pStyle w:val="PargrafodaLista"/>
-        <w:numPr>
-          <w:ilvl w:val="0"/>
-          <w:numId w:val="1"/>
-        </w:numPr>
+          <w:i/>
+          <w:iCs/>
+        </w:rPr>
+        <w:t xml:space="preserve"> - </w:t>
+      </w:r>
+      <w:proofErr w:type="spellStart"/>
+      <w:r>
+        <w:rPr>
+          <w:i/>
+          <w:iCs/>
+        </w:rPr>
+        <w:t>ResNet</w:t>
+      </w:r>
+      <w:proofErr w:type="spellEnd"/>
+      <w:r>
+        <w:rPr>
+          <w:i/>
+          <w:iCs/>
+        </w:rPr>
+        <w:t>\</w:t>
+      </w:r>
+      <w:r>
+        <w:rPr>
+          <w:i/>
+          <w:iCs/>
+        </w:rPr>
+        <w:t>training metrics.xlsx</w:t>
+      </w:r>
+      <w:r>
+        <w:rPr>
+          <w:i/>
+          <w:iCs/>
+        </w:rPr>
+        <w:t>"</w:t>
+      </w:r>
+    </w:p>
+    <w:p>
+      <w:pPr>
+        <w:pStyle w:val="PargrafodaLista"/>
+        <w:jc w:val="both"/>
+      </w:pPr>
+    </w:p>
+    <w:p>
+      <w:pPr>
+        <w:pStyle w:val="PargrafodaLista"/>
         <w:jc w:val="both"/>
         <w:rPr>
           <w:b/>
@@ -5289,7 +6687,7 @@
         <v:path o:extrusionok="f" gradientshapeok="t" o:connecttype="rect"/>
         <o:lock v:ext="edit" aspectratio="t"/>
       </v:shapetype>
-      <v:shape id="_x0000_i1029" type="#_x0000_t75" style="width:693.1pt;height:487.7pt;visibility:visible;mso-wrap-style:square" o:bullet="t">
+      <v:shape id="_x0000_i1031" type="#_x0000_t75" style="width:693.1pt;height:487.7pt;visibility:visible;mso-wrap-style:square" o:bullet="t">
         <v:imagedata r:id="rId1" o:title="" croptop="19686f" cropbottom="43833f" cropleft="8606f" cropright="55951f"/>
       </v:shape>
     </w:pict>

</xml_diff>